<commit_message>
fix: restore strategic brief Word template
</commit_message>
<xml_diff>
--- a/weekly_report_template.docx
+++ b/weekly_report_template.docx
@@ -111,7 +111,56 @@
           <w:rFonts w:ascii="FangSong" w:eastAsia="FangSong" w:hAnsi="FangSong" w:hint="eastAsia"/>
           <w:b/>
         </w:rPr>
-        <w:t>中国移动香港公司战略部                                                    YYYY年M月D日</w:t>
+        <w:t xml:space="preserve">中国移动香港公司战略部 </w:t>
+      </w:r>
+      <w:r>
+        <w:rPr>
+          <w:rFonts w:ascii="FangSong" w:eastAsia="FangSong" w:hAnsi="FangSong"/>
+          <w:b/>
+        </w:rPr>
+        <w:t xml:space="preserve">                                                   2026</w:t>
+      </w:r>
+      <w:r>
+        <w:rPr>
+          <w:rFonts w:ascii="FangSong" w:eastAsia="FangSong" w:hAnsi="FangSong" w:hint="eastAsia"/>
+          <w:b/>
+        </w:rPr>
+        <w:t>年</w:t>
+      </w:r>
+      <w:r>
+        <w:rPr>
+          <w:rFonts w:ascii="FangSong" w:eastAsia="FangSong" w:hAnsi="FangSong"/>
+          <w:b/>
+        </w:rPr>
+        <w:t>3</w:t>
+      </w:r>
+      <w:r>
+        <w:rPr>
+          <w:rFonts w:ascii="FangSong" w:eastAsia="FangSong" w:hAnsi="FangSong" w:hint="eastAsia"/>
+          <w:b/>
+        </w:rPr>
+        <w:t>月</w:t>
+      </w:r>
+      <w:r>
+        <w:rPr>
+          <w:rFonts w:ascii="FangSong" w:eastAsia="FangSong" w:hAnsi="FangSong"/>
+          <w:b/>
+        </w:rPr>
+        <w:t>1</w:t>
+      </w:r>
+      <w:r>
+        <w:rPr>
+          <w:rFonts w:ascii="FangSong" w:eastAsia="FangSong" w:hAnsi="FangSong"/>
+          <w:b/>
+        </w:rPr>
+        <w:t>6</w:t>
+      </w:r>
+      <w:r>
+        <w:rPr>
+          <w:rFonts w:ascii="FangSong" w:eastAsia="FangSong" w:hAnsi="FangSong" w:hint="eastAsia"/>
+          <w:b/>
+        </w:rPr>
+        <w:t>日</w:t>
       </w:r>
     </w:p>
     <w:p>
@@ -218,7 +267,29 @@
           <w:sz w:val="43"/>
           <w:szCs w:val="43"/>
         </w:rPr>
-        <w:t>目 录</w:t>
+        <w:t>目</w:t>
+      </w:r>
+      <w:r>
+        <w:rPr>
+          <w:rFonts w:ascii="FangSong" w:eastAsia="FangSong" w:hAnsi="FangSong" w:cs="SimHei"/>
+          <w:spacing w:val="39"/>
+          <w:position w:val="3"/>
+          <w:sz w:val="43"/>
+          <w:szCs w:val="43"/>
+        </w:rPr>
+        <w:t xml:space="preserve"> </w:t>
+      </w:r>
+      <w:r>
+        <w:rPr>
+          <w:rFonts w:ascii="FangSong" w:eastAsia="FangSong" w:hAnsi="FangSong" w:cs="SimHei"/>
+          <w:b/>
+          <w:bCs/>
+          <w:spacing w:val="-39"/>
+          <w:position w:val="3"/>
+          <w:sz w:val="43"/>
+          <w:szCs w:val="43"/>
+        </w:rPr>
+        <w:t>录</w:t>
       </w:r>
     </w:p>
     <w:p>
@@ -260,20 +331,49 @@
           <w:lang w:eastAsia="zh-CN"/>
         </w:rPr>
       </w:pPr>
+      <w:bookmarkStart w:id="0" w:name="OLE_LINK1"/>
+      <w:bookmarkStart w:id="1" w:name="OLE_LINK2"/>
       <w:r>
         <w:rPr>
           <w:lang w:eastAsia="zh-CN"/>
         </w:rPr>
-        <w:t>1.【标签】一句话事件标题</w:t>
-      </w:r>
-    </w:p>
-    <w:p>
-      <w:pPr>
-        <w:widowControl/>
-        <w:rPr>
-          <w:rFonts w:ascii="FangSong" w:eastAsia="FangSong" w:hAnsi="FangSong"/>
-          <w:color w:val="000000" w:themeColor="text1"/>
-          <w:sz w:val="28"/>
+        <w:t>1.</w:t>
+      </w:r>
+      <w:r>
+        <w:rPr>
+          <w:rFonts w:hint="eastAsia"/>
+          <w:lang w:eastAsia="zh-CN"/>
+        </w:rPr>
+        <w:t>【</w:t>
+      </w:r>
+      <w:r>
+        <w:rPr>
+          <w:rFonts w:hint="eastAsia"/>
+          <w:lang w:eastAsia="zh-CN"/>
+        </w:rPr>
+        <w:t>香港施政治理</w:t>
+      </w:r>
+      <w:r>
+        <w:rPr>
+          <w:rFonts w:hint="eastAsia"/>
+          <w:lang w:eastAsia="zh-CN"/>
+        </w:rPr>
+        <w:t>】</w:t>
+      </w:r>
+      <w:r>
+        <w:rPr>
+          <w:rFonts w:hint="eastAsia"/>
+          <w:lang w:eastAsia="zh-CN"/>
+        </w:rPr>
+        <w:t>李家超：今年内完成首份“香港五年规划”，全面对接国家“十五五”规划</w:t>
+      </w:r>
+    </w:p>
+    <w:p>
+      <w:pPr>
+        <w:pStyle w:val="af9"/>
+        <w:spacing w:before="101" w:line="360" w:lineRule="auto"/>
+        <w:rPr>
+          <w:lang w:eastAsia="zh-CN"/>
         </w:rPr>
       </w:pPr>
     </w:p>
@@ -365,6 +465,15 @@
     </w:p>
     <w:p>
       <w:pPr>
+        <w:pStyle w:val="af9"/>
+        <w:spacing w:before="101" w:line="360" w:lineRule="auto"/>
+        <w:rPr>
+          <w:lang w:eastAsia="zh-CN"/>
+        </w:rPr>
+      </w:pPr>
+    </w:p>
+    <w:p>
+      <w:pPr>
         <w:spacing w:line="360" w:lineRule="auto"/>
         <w:rPr>
           <w:rFonts w:ascii="FangSong" w:eastAsia="FangSong" w:hAnsi="FangSong"/>
@@ -380,7 +489,17 @@
           <w:sz w:val="34"/>
           <w:szCs w:val="34"/>
         </w:rPr>
-        <w:t>行业资讯</w:t>
+        <w:lastRenderedPageBreak/>
+        <w:t>行业</w:t>
+      </w:r>
+      <w:r>
+        <w:rPr>
+          <w:rFonts w:ascii="FangSong" w:eastAsia="FangSong" w:hAnsi="FangSong" w:hint="eastAsia"/>
+          <w:b/>
+          <w:sz w:val="34"/>
+          <w:szCs w:val="34"/>
+        </w:rPr>
+        <w:t>资讯</w:t>
       </w:r>
     </w:p>
     <w:p>
@@ -393,18 +512,345 @@
       </w:pPr>
       <w:r>
         <w:rPr>
+          <w:rFonts w:hint="eastAsia"/>
           <w:lang w:eastAsia="zh-CN"/>
         </w:rPr>
-        <w:t>2.【标签】一句话事件标题</w:t>
-      </w:r>
-    </w:p>
-    <w:p>
-      <w:pPr>
-        <w:widowControl/>
-        <w:rPr>
-          <w:rFonts w:ascii="FangSong" w:eastAsia="FangSong" w:hAnsi="FangSong"/>
-          <w:color w:val="000000" w:themeColor="text1"/>
-          <w:sz w:val="28"/>
+        <w:t>2</w:t>
+      </w:r>
+      <w:r>
+        <w:rPr>
+          <w:lang w:eastAsia="zh-CN"/>
+        </w:rPr>
+        <w:t>.</w:t>
+      </w:r>
+      <w:r>
+        <w:rPr>
+          <w:rFonts w:hint="eastAsia"/>
+          <w:lang w:eastAsia="zh-CN"/>
+        </w:rPr>
+        <w:t xml:space="preserve"> 【</w:t>
+      </w:r>
+      <w:r>
+        <w:rPr>
+          <w:rFonts w:hint="eastAsia"/>
+          <w:lang w:eastAsia="zh-CN"/>
+        </w:rPr>
+        <w:t>低空经济</w:t>
+      </w:r>
+      <w:r>
+        <w:rPr>
+          <w:rFonts w:hint="eastAsia"/>
+          <w:lang w:eastAsia="zh-CN"/>
+        </w:rPr>
+        <w:t>】</w:t>
+      </w:r>
+      <w:bookmarkEnd w:id="0"/>
+      <w:bookmarkEnd w:id="1"/>
+      <w:r>
+        <w:rPr>
+          <w:rFonts w:hint="eastAsia"/>
+          <w:spacing w:val="-1"/>
+          <w:lang w:eastAsia="zh-CN"/>
+        </w:rPr>
+        <w:t>香港环宇低空获超 1 亿美元 A 轮融资，布局全球低空网络</w:t>
+      </w:r>
+    </w:p>
+    <w:p>
+      <w:pPr>
+        <w:pStyle w:val="af9"/>
+        <w:spacing w:before="101" w:line="360" w:lineRule="auto"/>
+        <w:rPr>
+          <w:lang w:eastAsia="zh-CN"/>
+        </w:rPr>
+      </w:pPr>
+      <w:r>
+        <w:rPr>
+          <w:lang w:eastAsia="zh-CN"/>
+        </w:rPr>
+        <w:t>3.</w:t>
+      </w:r>
+      <w:r>
+        <w:rPr>
+          <w:rFonts w:hint="eastAsia"/>
+          <w:lang w:eastAsia="zh-CN"/>
+        </w:rPr>
+        <w:t>【</w:t>
+      </w:r>
+      <w:r>
+        <w:rPr>
+          <w:rFonts w:hint="eastAsia"/>
+          <w:lang w:eastAsia="zh-CN"/>
+        </w:rPr>
+        <w:t>香港施政治理</w:t>
+      </w:r>
+      <w:r>
+        <w:rPr>
+          <w:rFonts w:hint="eastAsia"/>
+          <w:lang w:eastAsia="zh-CN"/>
+        </w:rPr>
+        <w:t>】</w:t>
+      </w:r>
+      <w:r>
+        <w:rPr>
+          <w:rFonts w:hint="eastAsia"/>
+          <w:lang w:eastAsia="zh-CN"/>
+        </w:rPr>
+        <w:t>香港发布铁路标准并设审批组，北环线成本预计省 20%</w:t>
+      </w:r>
+    </w:p>
+    <w:p>
+      <w:pPr>
+        <w:pStyle w:val="af9"/>
+        <w:spacing w:before="101" w:line="360" w:lineRule="auto"/>
+        <w:rPr>
+          <w:lang w:eastAsia="zh-CN"/>
+        </w:rPr>
+      </w:pPr>
+      <w:r>
+        <w:rPr>
+          <w:rFonts w:hint="eastAsia"/>
+          <w:lang w:eastAsia="zh-CN"/>
+        </w:rPr>
+        <w:t>4</w:t>
+      </w:r>
+      <w:r>
+        <w:rPr>
+          <w:lang w:eastAsia="zh-CN"/>
+        </w:rPr>
+        <w:t>.</w:t>
+      </w:r>
+      <w:r>
+        <w:rPr>
+          <w:rFonts w:hint="eastAsia"/>
+          <w:lang w:eastAsia="zh-CN"/>
+        </w:rPr>
+        <w:t>【</w:t>
+      </w:r>
+      <w:r>
+        <w:rPr>
+          <w:rFonts w:hint="eastAsia"/>
+          <w:lang w:eastAsia="zh-CN"/>
+        </w:rPr>
+        <w:t>人工智能</w:t>
+      </w:r>
+      <w:r>
+        <w:rPr>
+          <w:rFonts w:hint="eastAsia"/>
+          <w:lang w:eastAsia="zh-CN"/>
+        </w:rPr>
+        <w:t>】</w:t>
+      </w:r>
+      <w:r>
+        <w:rPr>
+          <w:rFonts w:hint="eastAsia"/>
+          <w:lang w:eastAsia="zh-CN"/>
+        </w:rPr>
+        <w:t>港澳首个共同资助联合实验室成立，聚焦机器人与具身智能</w:t>
+      </w:r>
+    </w:p>
+    <w:p>
+      <w:pPr>
+        <w:pStyle w:val="af9"/>
+        <w:spacing w:before="101" w:line="360" w:lineRule="auto"/>
+        <w:rPr>
+          <w:lang w:eastAsia="zh-CN"/>
+        </w:rPr>
+      </w:pPr>
+      <w:r>
+        <w:rPr>
+          <w:rFonts w:hint="eastAsia"/>
+          <w:lang w:eastAsia="zh-CN"/>
+        </w:rPr>
+        <w:t>5</w:t>
+      </w:r>
+      <w:r>
+        <w:rPr>
+          <w:lang w:eastAsia="zh-CN"/>
+        </w:rPr>
+        <w:t>.</w:t>
+      </w:r>
+      <w:r>
+        <w:rPr>
+          <w:rFonts w:hint="eastAsia"/>
+          <w:lang w:eastAsia="zh-CN"/>
+        </w:rPr>
+        <w:t>【</w:t>
+      </w:r>
+      <w:r>
+        <w:rPr>
+          <w:rFonts w:hint="eastAsia"/>
+          <w:lang w:eastAsia="zh-CN"/>
+        </w:rPr>
+        <w:t>八大中心</w:t>
+      </w:r>
+      <w:r>
+        <w:rPr>
+          <w:rFonts w:hint="eastAsia"/>
+          <w:lang w:eastAsia="zh-CN"/>
+        </w:rPr>
+        <w:t>】</w:t>
+      </w:r>
+      <w:r>
+        <w:rPr>
+          <w:rFonts w:hint="eastAsia"/>
+          <w:lang w:eastAsia="zh-CN"/>
+        </w:rPr>
+        <w:t>香港推出四大金融发展措施，巩固国际金融中心地位</w:t>
+      </w:r>
+    </w:p>
+    <w:p>
+      <w:pPr>
+        <w:pStyle w:val="af9"/>
+        <w:spacing w:before="101" w:line="360" w:lineRule="auto"/>
+        <w:rPr>
+          <w:lang w:eastAsia="zh-CN"/>
+        </w:rPr>
+      </w:pPr>
+      <w:r>
+        <w:rPr>
+          <w:rFonts w:hint="eastAsia"/>
+          <w:lang w:eastAsia="zh-CN"/>
+        </w:rPr>
+        <w:t>6</w:t>
+      </w:r>
+      <w:r>
+        <w:rPr>
+          <w:lang w:eastAsia="zh-CN"/>
+        </w:rPr>
+        <w:t>.</w:t>
+      </w:r>
+      <w:bookmarkStart w:id="2" w:name="OLE_LINK7"/>
+      <w:bookmarkStart w:id="3" w:name="OLE_LINK8"/>
+      <w:r>
+        <w:rPr>
+          <w:rFonts w:hint="eastAsia"/>
+          <w:lang w:eastAsia="zh-CN"/>
+        </w:rPr>
+        <w:t>【</w:t>
+      </w:r>
+      <w:r>
+        <w:rPr>
+          <w:rFonts w:hint="eastAsia"/>
+          <w:lang w:eastAsia="zh-CN"/>
+        </w:rPr>
+        <w:t>漫游市场需求</w:t>
+      </w:r>
+      <w:r>
+        <w:rPr>
+          <w:rFonts w:hint="eastAsia"/>
+          <w:lang w:eastAsia="zh-CN"/>
+        </w:rPr>
+        <w:t>】</w:t>
+      </w:r>
+      <w:bookmarkEnd w:id="2"/>
+      <w:bookmarkEnd w:id="3"/>
+      <w:r>
+        <w:rPr>
+          <w:rFonts w:hint="eastAsia"/>
+          <w:lang w:eastAsia="zh-CN"/>
+        </w:rPr>
+        <w:t>香港新春旅游消费市场全面回暖，跨境便利成核心驱动力</w:t>
+      </w:r>
+    </w:p>
+    <w:p>
+      <w:pPr>
+        <w:pStyle w:val="af9"/>
+        <w:spacing w:before="101" w:line="360" w:lineRule="auto"/>
+        <w:rPr>
+          <w:lang w:eastAsia="zh-CN"/>
+        </w:rPr>
+      </w:pPr>
+      <w:r>
+        <w:rPr>
+          <w:rFonts w:hint="eastAsia"/>
+          <w:lang w:eastAsia="zh-CN"/>
+        </w:rPr>
+        <w:t>7.</w:t>
+      </w:r>
+      <w:r>
+        <w:rPr>
+          <w:rFonts w:hint="eastAsia"/>
+          <w:lang w:eastAsia="zh-CN"/>
+        </w:rPr>
+        <w:t>【</w:t>
+      </w:r>
+      <w:r>
+        <w:rPr>
+          <w:rFonts w:hint="eastAsia"/>
+          <w:lang w:eastAsia="zh-CN"/>
+        </w:rPr>
+        <w:t>香港施政治理</w:t>
+      </w:r>
+      <w:r>
+        <w:rPr>
+          <w:rFonts w:hint="eastAsia"/>
+          <w:lang w:eastAsia="zh-CN"/>
+        </w:rPr>
+        <w:t>】</w:t>
+      </w:r>
+      <w:r>
+        <w:rPr>
+          <w:rFonts w:hint="eastAsia"/>
+          <w:lang w:eastAsia="zh-CN"/>
+        </w:rPr>
+        <w:t>桂港举办合作推介会，携手拓展东盟多领域合作</w:t>
+      </w:r>
+    </w:p>
+    <w:p>
+      <w:pPr>
+        <w:pStyle w:val="af9"/>
+        <w:spacing w:before="101" w:line="360" w:lineRule="auto"/>
+        <w:rPr>
+          <w:lang w:eastAsia="zh-CN"/>
+        </w:rPr>
+      </w:pPr>
+      <w:r>
+        <w:rPr>
+          <w:rFonts w:hint="eastAsia"/>
+          <w:lang w:eastAsia="zh-CN"/>
+        </w:rPr>
+        <w:t>8</w:t>
+      </w:r>
+      <w:r>
+        <w:rPr>
+          <w:lang w:eastAsia="zh-CN"/>
+        </w:rPr>
+        <w:t>.</w:t>
+      </w:r>
+      <w:r>
+        <w:rPr>
+          <w:rFonts w:hint="eastAsia"/>
+          <w:lang w:eastAsia="zh-CN"/>
+        </w:rPr>
+        <w:t>【</w:t>
+      </w:r>
+      <w:r>
+        <w:rPr>
+          <w:lang w:eastAsia="zh-CN"/>
+        </w:rPr>
+        <w:t>Web3.0</w:t>
+      </w:r>
+      <w:r>
+        <w:rPr>
+          <w:rFonts w:hint="eastAsia"/>
+          <w:lang w:eastAsia="zh-CN"/>
+        </w:rPr>
+        <w:t>】</w:t>
+      </w:r>
+      <w:r>
+        <w:rPr>
+          <w:rFonts w:hint="eastAsia"/>
+          <w:lang w:eastAsia="zh-CN"/>
+        </w:rPr>
+        <w:t>香港拟3月发出首批法币稳定币牌照，并将提交数字资产政策法案</w:t>
+      </w:r>
+    </w:p>
+    <w:p>
+      <w:pPr>
+        <w:pStyle w:val="af9"/>
+        <w:spacing w:before="101" w:line="360" w:lineRule="auto"/>
+        <w:rPr>
+          <w:lang w:eastAsia="zh-CN"/>
         </w:rPr>
       </w:pPr>
     </w:p>
@@ -425,7 +871,16 @@
           <w:sz w:val="34"/>
           <w:szCs w:val="34"/>
         </w:rPr>
-        <w:t>社会资讯</w:t>
+        <w:t>社会</w:t>
+      </w:r>
+      <w:r>
+        <w:rPr>
+          <w:rFonts w:ascii="FangSong" w:eastAsia="FangSong" w:hAnsi="FangSong" w:hint="eastAsia"/>
+          <w:b/>
+          <w:sz w:val="34"/>
+          <w:szCs w:val="34"/>
+        </w:rPr>
+        <w:t>资讯</w:t>
       </w:r>
     </w:p>
     <w:p>
@@ -438,18 +893,52 @@
       </w:pPr>
       <w:r>
         <w:rPr>
+          <w:rFonts w:hint="eastAsia"/>
           <w:lang w:eastAsia="zh-CN"/>
         </w:rPr>
-        <w:t>3.【标签】一句话事件标题</w:t>
-      </w:r>
-    </w:p>
-    <w:p>
-      <w:pPr>
-        <w:widowControl/>
-        <w:rPr>
-          <w:rFonts w:ascii="FangSong" w:eastAsia="FangSong" w:hAnsi="FangSong"/>
-          <w:color w:val="000000" w:themeColor="text1"/>
-          <w:sz w:val="28"/>
+        <w:t>9</w:t>
+      </w:r>
+      <w:r>
+        <w:rPr>
+          <w:lang w:eastAsia="zh-CN"/>
+        </w:rPr>
+        <w:t>.</w:t>
+      </w:r>
+      <w:r>
+        <w:rPr>
+          <w:rFonts w:hint="eastAsia"/>
+          <w:lang w:eastAsia="zh-CN"/>
+        </w:rPr>
+        <w:t>【</w:t>
+      </w:r>
+      <w:r>
+        <w:rPr>
+          <w:rFonts w:hint="eastAsia"/>
+          <w:lang w:eastAsia="zh-CN"/>
+        </w:rPr>
+        <w:t>本地生活</w:t>
+      </w:r>
+      <w:r>
+        <w:rPr>
+          <w:rFonts w:hint="eastAsia"/>
+          <w:lang w:eastAsia="zh-CN"/>
+        </w:rPr>
+        <w:t>】</w:t>
+      </w:r>
+      <w:r>
+        <w:rPr>
+          <w:rFonts w:hint="eastAsia"/>
+          <w:lang w:eastAsia="zh-CN"/>
+        </w:rPr>
+        <w:t>香港公屋轮候机制持续优化，综合轮候时间维持近年低位</w:t>
+      </w:r>
+    </w:p>
+    <w:p>
+      <w:pPr>
+        <w:pStyle w:val="af9"/>
+        <w:spacing w:before="101" w:line="360" w:lineRule="auto"/>
+        <w:rPr>
+          <w:lang w:eastAsia="zh-CN"/>
         </w:rPr>
       </w:pPr>
     </w:p>
@@ -470,7 +959,16 @@
           <w:sz w:val="34"/>
           <w:szCs w:val="34"/>
         </w:rPr>
-        <w:t>国际资讯</w:t>
+        <w:t>国际</w:t>
+      </w:r>
+      <w:r>
+        <w:rPr>
+          <w:rFonts w:ascii="FangSong" w:eastAsia="FangSong" w:hAnsi="FangSong" w:hint="eastAsia"/>
+          <w:b/>
+          <w:sz w:val="34"/>
+          <w:szCs w:val="34"/>
+        </w:rPr>
+        <w:t>资讯</w:t>
       </w:r>
     </w:p>
     <w:p>
@@ -485,76 +983,37 @@
         <w:rPr>
           <w:lang w:eastAsia="zh-CN"/>
         </w:rPr>
-        <w:t>4.【标签】一句话事件标题</w:t>
-      </w:r>
-    </w:p>
-    <w:p>
-      <w:pPr>
-        <w:widowControl/>
-        <w:rPr>
-          <w:rFonts w:ascii="FangSong" w:eastAsia="FangSong" w:hAnsi="FangSong"/>
-          <w:color w:val="000000" w:themeColor="text1"/>
-          <w:sz w:val="28"/>
-        </w:rPr>
-      </w:pPr>
-    </w:p>
-    <w:p>
-      <w:pPr>
-        <w:pStyle w:val="af9"/>
-        <w:spacing w:before="101" w:line="360" w:lineRule="auto"/>
-        <w:rPr>
+        <w:lastRenderedPageBreak/>
+        <w:t>10.</w:t>
+      </w:r>
+      <w:r>
+        <w:rPr>
+          <w:rFonts w:hint="eastAsia"/>
           <w:lang w:eastAsia="zh-CN"/>
         </w:rPr>
-      </w:pPr>
-    </w:p>
-    <w:p>
-      <w:pPr>
-        <w:spacing w:line="360" w:lineRule="auto"/>
-        <w:rPr>
-          <w:rFonts w:ascii="FangSong" w:eastAsia="FangSong" w:hAnsi="FangSong"/>
-          <w:b/>
-          <w:sz w:val="34"/>
-          <w:szCs w:val="34"/>
-        </w:rPr>
-      </w:pPr>
-    </w:p>
-    <w:p>
-      <w:pPr>
-        <w:pStyle w:val="af9"/>
-        <w:spacing w:before="101" w:line="360" w:lineRule="auto"/>
-        <w:rPr>
+        <w:t>【</w:t>
+      </w:r>
+      <w:r>
+        <w:rPr>
+          <w:rFonts w:hint="eastAsia"/>
           <w:lang w:eastAsia="zh-CN"/>
         </w:rPr>
-      </w:pPr>
-    </w:p>
-    <w:p>
-      <w:pPr>
-        <w:pStyle w:val="af9"/>
-        <w:spacing w:before="101" w:line="360" w:lineRule="auto"/>
-        <w:rPr>
+        <w:t>地缘政治与经济</w:t>
+      </w:r>
+      <w:r>
+        <w:rPr>
+          <w:rFonts w:hint="eastAsia"/>
           <w:lang w:eastAsia="zh-CN"/>
         </w:rPr>
-      </w:pPr>
-    </w:p>
-    <w:p>
-      <w:pPr>
-        <w:spacing w:line="360" w:lineRule="auto"/>
-        <w:rPr>
-          <w:rFonts w:ascii="FangSong" w:eastAsia="FangSong" w:hAnsi="FangSong"/>
-          <w:b/>
-          <w:sz w:val="34"/>
-          <w:szCs w:val="34"/>
-        </w:rPr>
-      </w:pPr>
-    </w:p>
-    <w:p>
-      <w:pPr>
-        <w:pStyle w:val="af9"/>
-        <w:spacing w:before="101" w:line="360" w:lineRule="auto"/>
-        <w:rPr>
+        <w:t>】</w:t>
+      </w:r>
+      <w:r>
+        <w:rPr>
+          <w:rFonts w:hint="eastAsia"/>
           <w:lang w:eastAsia="zh-CN"/>
         </w:rPr>
-      </w:pPr>
+        <w:t>中资在新加坡固定资产投资激增八倍，首次超过美国</w:t>
+      </w:r>
     </w:p>
     <w:p>
       <w:pPr>
@@ -569,9 +1028,20 @@
           <w:szCs w:val="31"/>
         </w:rPr>
       </w:pPr>
-    </w:p>
-    <w:p>
-      <w:pPr>
+      <w:r>
+        <w:rPr>
+          <w:rFonts w:ascii="FangSong" w:eastAsia="FangSong" w:hAnsi="FangSong" w:cs="FangSong" w:hint="eastAsia"/>
+          <w:noProof/>
+          <w:snapToGrid w:val="0"/>
+          <w:color w:val="000000"/>
+          <w:spacing w:val="-1"/>
+          <w:kern w:val="0"/>
+          <w:sz w:val="31"/>
+          <w:szCs w:val="31"/>
+        </w:rPr>
+        <w:t>1</w:t>
+      </w:r>
+      <w:r>
         <w:rPr>
           <w:rFonts w:ascii="FangSong" w:eastAsia="FangSong" w:hAnsi="FangSong" w:cs="FangSong"/>
           <w:noProof/>
@@ -582,7 +1052,60 @@
           <w:sz w:val="31"/>
           <w:szCs w:val="31"/>
         </w:rPr>
-      </w:pPr>
+        <w:t>1.</w:t>
+      </w:r>
+      <w:r>
+        <w:rPr>
+          <w:rFonts w:ascii="FangSong" w:eastAsia="FangSong" w:hAnsi="FangSong" w:cs="FangSong" w:hint="eastAsia"/>
+          <w:noProof/>
+          <w:snapToGrid w:val="0"/>
+          <w:color w:val="000000"/>
+          <w:spacing w:val="-1"/>
+          <w:kern w:val="0"/>
+          <w:sz w:val="31"/>
+          <w:szCs w:val="31"/>
+        </w:rPr>
+        <w:t>【</w:t>
+      </w:r>
+      <w:r>
+        <w:rPr>
+          <w:rFonts w:ascii="FangSong" w:eastAsia="FangSong" w:hAnsi="FangSong" w:cs="FangSong" w:hint="eastAsia"/>
+          <w:noProof/>
+          <w:snapToGrid w:val="0"/>
+          <w:color w:val="000000"/>
+          <w:spacing w:val="-1"/>
+          <w:kern w:val="0"/>
+          <w:sz w:val="31"/>
+          <w:szCs w:val="31"/>
+        </w:rPr>
+        <w:t>人工智能</w:t>
+      </w:r>
+      <w:r>
+        <w:rPr>
+          <w:rFonts w:ascii="FangSong" w:eastAsia="FangSong" w:hAnsi="FangSong" w:cs="FangSong" w:hint="eastAsia"/>
+          <w:noProof/>
+          <w:snapToGrid w:val="0"/>
+          <w:color w:val="000000"/>
+          <w:spacing w:val="-1"/>
+          <w:kern w:val="0"/>
+          <w:sz w:val="31"/>
+          <w:szCs w:val="31"/>
+        </w:rPr>
+        <w:t>】</w:t>
+      </w:r>
+      <w:r>
+        <w:rPr>
+          <w:rFonts w:ascii="FangSong" w:eastAsia="FangSong" w:hAnsi="FangSong" w:cs="FangSong" w:hint="eastAsia"/>
+          <w:noProof/>
+          <w:snapToGrid w:val="0"/>
+          <w:color w:val="000000"/>
+          <w:spacing w:val="-1"/>
+          <w:kern w:val="0"/>
+          <w:sz w:val="31"/>
+          <w:szCs w:val="31"/>
+        </w:rPr>
+        <w:t>全球半导体销售额预计今年达1万亿美元，AI成主要驱动力</w:t>
+      </w:r>
     </w:p>
     <w:p>
       <w:pPr>
@@ -597,9 +1120,20 @@
           <w:szCs w:val="31"/>
         </w:rPr>
       </w:pPr>
-    </w:p>
-    <w:p>
-      <w:pPr>
+      <w:r>
+        <w:rPr>
+          <w:rFonts w:ascii="FangSong" w:eastAsia="FangSong" w:hAnsi="FangSong" w:cs="FangSong" w:hint="eastAsia"/>
+          <w:noProof/>
+          <w:snapToGrid w:val="0"/>
+          <w:color w:val="000000"/>
+          <w:spacing w:val="-1"/>
+          <w:kern w:val="0"/>
+          <w:sz w:val="31"/>
+          <w:szCs w:val="31"/>
+        </w:rPr>
+        <w:t>1</w:t>
+      </w:r>
+      <w:r>
         <w:rPr>
           <w:rFonts w:ascii="FangSong" w:eastAsia="FangSong" w:hAnsi="FangSong" w:cs="FangSong"/>
           <w:noProof/>
@@ -610,7 +1144,34 @@
           <w:sz w:val="31"/>
           <w:szCs w:val="31"/>
         </w:rPr>
-      </w:pPr>
+        <w:t>2.</w:t>
+      </w:r>
+      <w:r>
+        <w:rPr>
+          <w:rFonts w:ascii="FangSong" w:eastAsia="FangSong" w:hAnsi="FangSong" w:cs="FangSong" w:hint="eastAsia"/>
+          <w:noProof/>
+          <w:snapToGrid w:val="0"/>
+          <w:color w:val="000000"/>
+          <w:spacing w:val="-1"/>
+          <w:kern w:val="0"/>
+          <w:sz w:val="31"/>
+          <w:szCs w:val="31"/>
+        </w:rPr>
+        <w:t>【友商动态】</w:t>
+      </w:r>
+      <w:r>
+        <w:rPr>
+          <w:rFonts w:ascii="FangSong" w:eastAsia="FangSong" w:hAnsi="FangSong" w:cs="FangSong" w:hint="eastAsia"/>
+          <w:noProof/>
+          <w:snapToGrid w:val="0"/>
+          <w:color w:val="000000"/>
+          <w:spacing w:val="-1"/>
+          <w:kern w:val="0"/>
+          <w:sz w:val="31"/>
+          <w:szCs w:val="31"/>
+        </w:rPr>
+        <w:t>KDDI成立运营子公司KDDI i-let，推进AI社会应用</w:t>
+      </w:r>
     </w:p>
     <w:p>
       <w:pPr>
@@ -625,9 +1186,20 @@
           <w:szCs w:val="31"/>
         </w:rPr>
       </w:pPr>
-    </w:p>
-    <w:p>
-      <w:pPr>
+      <w:r>
+        <w:rPr>
+          <w:rFonts w:ascii="FangSong" w:eastAsia="FangSong" w:hAnsi="FangSong" w:cs="FangSong" w:hint="eastAsia"/>
+          <w:noProof/>
+          <w:snapToGrid w:val="0"/>
+          <w:color w:val="000000"/>
+          <w:spacing w:val="-1"/>
+          <w:kern w:val="0"/>
+          <w:sz w:val="31"/>
+          <w:szCs w:val="31"/>
+        </w:rPr>
+        <w:t>1</w:t>
+      </w:r>
+      <w:r>
         <w:rPr>
           <w:rFonts w:ascii="FangSong" w:eastAsia="FangSong" w:hAnsi="FangSong" w:cs="FangSong"/>
           <w:noProof/>
@@ -638,6 +1210,257 @@
           <w:sz w:val="31"/>
           <w:szCs w:val="31"/>
         </w:rPr>
+        <w:t>3.</w:t>
+      </w:r>
+      <w:r>
+        <w:rPr>
+          <w:rFonts w:ascii="FangSong" w:eastAsia="FangSong" w:hAnsi="FangSong" w:cs="FangSong" w:hint="eastAsia"/>
+          <w:noProof/>
+          <w:snapToGrid w:val="0"/>
+          <w:color w:val="000000"/>
+          <w:spacing w:val="-1"/>
+          <w:kern w:val="0"/>
+          <w:sz w:val="31"/>
+          <w:szCs w:val="31"/>
+        </w:rPr>
+        <w:t>【</w:t>
+      </w:r>
+      <w:r>
+        <w:rPr>
+          <w:rFonts w:ascii="FangSong" w:eastAsia="FangSong" w:hAnsi="FangSong" w:cs="FangSong" w:hint="eastAsia"/>
+          <w:noProof/>
+          <w:snapToGrid w:val="0"/>
+          <w:color w:val="000000"/>
+          <w:spacing w:val="-1"/>
+          <w:kern w:val="0"/>
+          <w:sz w:val="31"/>
+          <w:szCs w:val="31"/>
+        </w:rPr>
+        <w:t>行业相关监管</w:t>
+      </w:r>
+      <w:r>
+        <w:rPr>
+          <w:rFonts w:ascii="FangSong" w:eastAsia="FangSong" w:hAnsi="FangSong" w:cs="FangSong" w:hint="eastAsia"/>
+          <w:noProof/>
+          <w:snapToGrid w:val="0"/>
+          <w:color w:val="000000"/>
+          <w:spacing w:val="-1"/>
+          <w:kern w:val="0"/>
+          <w:sz w:val="31"/>
+          <w:szCs w:val="31"/>
+        </w:rPr>
+        <w:t>】</w:t>
+      </w:r>
+      <w:r>
+        <w:rPr>
+          <w:rFonts w:ascii="FangSong" w:eastAsia="FangSong" w:hAnsi="FangSong" w:cs="FangSong" w:hint="eastAsia"/>
+          <w:noProof/>
+          <w:snapToGrid w:val="0"/>
+          <w:color w:val="000000"/>
+          <w:spacing w:val="-1"/>
+          <w:kern w:val="0"/>
+          <w:sz w:val="31"/>
+          <w:szCs w:val="31"/>
+        </w:rPr>
+        <w:t>欧盟无条件批准谷歌320亿美元收购网络安全公司Wiz</w:t>
+      </w:r>
+    </w:p>
+    <w:p>
+      <w:pPr>
+        <w:rPr>
+          <w:rFonts w:ascii="FangSong" w:eastAsia="FangSong" w:hAnsi="FangSong" w:cs="FangSong"/>
+          <w:noProof/>
+          <w:snapToGrid w:val="0"/>
+          <w:color w:val="000000"/>
+          <w:spacing w:val="-1"/>
+          <w:kern w:val="0"/>
+          <w:sz w:val="31"/>
+          <w:szCs w:val="31"/>
+        </w:rPr>
+      </w:pPr>
+      <w:r>
+        <w:rPr>
+          <w:rFonts w:ascii="FangSong" w:eastAsia="FangSong" w:hAnsi="FangSong" w:cs="FangSong" w:hint="eastAsia"/>
+          <w:noProof/>
+          <w:snapToGrid w:val="0"/>
+          <w:color w:val="000000"/>
+          <w:spacing w:val="-1"/>
+          <w:kern w:val="0"/>
+          <w:sz w:val="31"/>
+          <w:szCs w:val="31"/>
+        </w:rPr>
+        <w:t>1</w:t>
+      </w:r>
+      <w:r>
+        <w:rPr>
+          <w:rFonts w:ascii="FangSong" w:eastAsia="FangSong" w:hAnsi="FangSong" w:cs="FangSong"/>
+          <w:noProof/>
+          <w:snapToGrid w:val="0"/>
+          <w:color w:val="000000"/>
+          <w:spacing w:val="-1"/>
+          <w:kern w:val="0"/>
+          <w:sz w:val="31"/>
+          <w:szCs w:val="31"/>
+        </w:rPr>
+        <w:t>4.</w:t>
+      </w:r>
+      <w:r>
+        <w:rPr>
+          <w:rFonts w:ascii="FangSong" w:eastAsia="FangSong" w:hAnsi="FangSong" w:cs="FangSong" w:hint="eastAsia"/>
+          <w:noProof/>
+          <w:snapToGrid w:val="0"/>
+          <w:color w:val="000000"/>
+          <w:spacing w:val="-1"/>
+          <w:kern w:val="0"/>
+          <w:sz w:val="31"/>
+          <w:szCs w:val="31"/>
+        </w:rPr>
+        <w:t>【</w:t>
+      </w:r>
+      <w:r>
+        <w:rPr>
+          <w:rFonts w:ascii="FangSong" w:eastAsia="FangSong" w:hAnsi="FangSong" w:cs="FangSong" w:hint="eastAsia"/>
+          <w:noProof/>
+          <w:snapToGrid w:val="0"/>
+          <w:color w:val="000000"/>
+          <w:spacing w:val="-1"/>
+          <w:kern w:val="0"/>
+          <w:sz w:val="31"/>
+          <w:szCs w:val="31"/>
+        </w:rPr>
+        <w:t>跨境贸易</w:t>
+      </w:r>
+      <w:r>
+        <w:rPr>
+          <w:rFonts w:ascii="FangSong" w:eastAsia="FangSong" w:hAnsi="FangSong" w:cs="FangSong" w:hint="eastAsia"/>
+          <w:noProof/>
+          <w:snapToGrid w:val="0"/>
+          <w:color w:val="000000"/>
+          <w:spacing w:val="-1"/>
+          <w:kern w:val="0"/>
+          <w:sz w:val="31"/>
+          <w:szCs w:val="31"/>
+        </w:rPr>
+        <w:t>】</w:t>
+      </w:r>
+      <w:r>
+        <w:rPr>
+          <w:rFonts w:ascii="FangSong" w:eastAsia="FangSong" w:hAnsi="FangSong" w:cs="FangSong" w:hint="eastAsia"/>
+          <w:noProof/>
+          <w:snapToGrid w:val="0"/>
+          <w:color w:val="000000"/>
+          <w:spacing w:val="-1"/>
+          <w:kern w:val="0"/>
+          <w:sz w:val="31"/>
+          <w:szCs w:val="31"/>
+        </w:rPr>
+        <w:t>京东自建欧洲物流网络JoyExpress上线，支持同日及次日达</w:t>
+      </w:r>
+    </w:p>
+    <w:p>
+      <w:pPr>
+        <w:rPr>
+          <w:rFonts w:ascii="FangSong" w:eastAsia="FangSong" w:hAnsi="FangSong" w:cs="FangSong"/>
+          <w:noProof/>
+          <w:snapToGrid w:val="0"/>
+          <w:color w:val="000000"/>
+          <w:spacing w:val="-1"/>
+          <w:kern w:val="0"/>
+          <w:sz w:val="31"/>
+          <w:szCs w:val="31"/>
+        </w:rPr>
+      </w:pPr>
+      <w:r>
+        <w:rPr>
+          <w:rFonts w:ascii="FangSong" w:eastAsia="FangSong" w:hAnsi="FangSong" w:cs="FangSong" w:hint="eastAsia"/>
+          <w:noProof/>
+          <w:snapToGrid w:val="0"/>
+          <w:color w:val="000000"/>
+          <w:spacing w:val="-1"/>
+          <w:kern w:val="0"/>
+          <w:sz w:val="31"/>
+          <w:szCs w:val="31"/>
+        </w:rPr>
+        <w:t>1</w:t>
+      </w:r>
+      <w:r>
+        <w:rPr>
+          <w:rFonts w:ascii="FangSong" w:eastAsia="FangSong" w:hAnsi="FangSong" w:cs="FangSong"/>
+          <w:noProof/>
+          <w:snapToGrid w:val="0"/>
+          <w:color w:val="000000"/>
+          <w:spacing w:val="-1"/>
+          <w:kern w:val="0"/>
+          <w:sz w:val="31"/>
+          <w:szCs w:val="31"/>
+        </w:rPr>
+        <w:t>5.</w:t>
+      </w:r>
+      <w:r>
+        <w:rPr>
+          <w:rFonts w:ascii="FangSong" w:eastAsia="FangSong" w:hAnsi="FangSong" w:cs="FangSong" w:hint="eastAsia"/>
+          <w:noProof/>
+          <w:snapToGrid w:val="0"/>
+          <w:color w:val="000000"/>
+          <w:spacing w:val="-1"/>
+          <w:kern w:val="0"/>
+          <w:sz w:val="31"/>
+          <w:szCs w:val="31"/>
+        </w:rPr>
+        <w:t>【</w:t>
+      </w:r>
+      <w:r>
+        <w:rPr>
+          <w:rFonts w:ascii="FangSong" w:eastAsia="FangSong" w:hAnsi="FangSong" w:cs="FangSong" w:hint="eastAsia"/>
+          <w:noProof/>
+          <w:snapToGrid w:val="0"/>
+          <w:color w:val="000000"/>
+          <w:spacing w:val="-1"/>
+          <w:kern w:val="0"/>
+          <w:sz w:val="31"/>
+          <w:szCs w:val="31"/>
+        </w:rPr>
+        <w:t>友商动态</w:t>
+      </w:r>
+      <w:r>
+        <w:rPr>
+          <w:rFonts w:ascii="FangSong" w:eastAsia="FangSong" w:hAnsi="FangSong" w:cs="FangSong" w:hint="eastAsia"/>
+          <w:noProof/>
+          <w:snapToGrid w:val="0"/>
+          <w:color w:val="000000"/>
+          <w:spacing w:val="-1"/>
+          <w:kern w:val="0"/>
+          <w:sz w:val="31"/>
+          <w:szCs w:val="31"/>
+        </w:rPr>
+        <w:t>】</w:t>
+      </w:r>
+      <w:r>
+        <w:rPr>
+          <w:rFonts w:ascii="FangSong" w:eastAsia="FangSong" w:hAnsi="FangSong" w:cs="FangSong" w:hint="eastAsia"/>
+          <w:noProof/>
+          <w:snapToGrid w:val="0"/>
+          <w:color w:val="000000"/>
+          <w:spacing w:val="-1"/>
+          <w:kern w:val="0"/>
+          <w:sz w:val="31"/>
+          <w:szCs w:val="31"/>
+        </w:rPr>
+        <w:t>AT&amp;T与AWS深度整合光纤、卫星与云服务，构建全域企业连接新生态</w:t>
+      </w:r>
+    </w:p>
+    <w:p>
+      <w:pPr>
+        <w:rPr>
+          <w:rFonts w:ascii="FangSong" w:eastAsia="FangSong" w:hAnsi="FangSong" w:cs="FangSong"/>
+          <w:noProof/>
+          <w:snapToGrid w:val="0"/>
+          <w:color w:val="000000"/>
+          <w:spacing w:val="-1"/>
+          <w:kern w:val="0"/>
+          <w:sz w:val="31"/>
+          <w:szCs w:val="31"/>
+        </w:rPr>
       </w:pPr>
     </w:p>
     <w:p>
@@ -649,6 +1472,13 @@
           <w:color w:val="000000" w:themeColor="text1"/>
         </w:rPr>
       </w:pPr>
+      <w:r>
+        <w:br w:type="page"/>
+      </w:r>
+      <w:bookmarkStart w:id="4" w:name="_Hlk88818722"/>
+      <w:bookmarkStart w:id="5" w:name="_Hlk92465682"/>
+      <w:bookmarkStart w:id="6" w:name="_Hlk103328591"/>
+      <w:bookmarkStart w:id="7" w:name="_Hlk175934949"/>
     </w:p>
     <w:p>
       <w:pPr>
@@ -671,6 +1501,7 @@
           <w:sz w:val="44"/>
           <w:szCs w:val="32"/>
         </w:rPr>
+        <w:lastRenderedPageBreak/>
         <w:t>政治资讯</w:t>
       </w:r>
     </w:p>
@@ -691,7 +1522,7 @@
           <w:color w:val="A6A6A6" w:themeColor="background1" w:themeShade="A6"/>
           <w:sz w:val="28"/>
         </w:rPr>
-        <w:t>标签</w:t>
+        <w:t>香港施政治理</w:t>
       </w:r>
     </w:p>
     <w:p>
@@ -713,7 +1544,17 @@
           <w:sz w:val="28"/>
           <w:u w:val="single"/>
         </w:rPr>
-        <w:t>一、一句话事件标题</w:t>
+        <w:t>一、</w:t>
+      </w:r>
+      <w:r>
+        <w:rPr>
+          <w:rFonts w:ascii="FangSong" w:eastAsia="FangSong" w:hAnsi="FangSong" w:hint="eastAsia"/>
+          <w:b/>
+          <w:color w:val="000000" w:themeColor="text1"/>
+          <w:sz w:val="28"/>
+          <w:u w:val="single"/>
+        </w:rPr>
+        <w:t>李家超：今年内完成首份“香港五年规划”，全面对接国家“十五五”规划</w:t>
       </w:r>
     </w:p>
     <w:p>
@@ -731,18 +1572,8 @@
           <w:color w:val="000000" w:themeColor="text1"/>
           <w:sz w:val="28"/>
         </w:rPr>
-        <w:t>事件事实正文。只写公开来源可复核事实，不写爬虫运行过程。</w:t>
-      </w:r>
-    </w:p>
-    <w:p>
-      <w:pPr>
-        <w:widowControl/>
-        <w:rPr>
-          <w:rFonts w:ascii="FangSong" w:eastAsia="FangSong" w:hAnsi="FangSong"/>
-          <w:color w:val="000000" w:themeColor="text1"/>
-          <w:sz w:val="28"/>
-        </w:rPr>
-      </w:pPr>
+        <w:t>行政长官李家超表示，特区政府各政策局已成立对接“十五五”规划编制小组并全速工作，将于今年内完成首份具宏观性、战略性和前瞻性的“香港五年规划”。该规划将勾勒香港未来五年的发展愿景与核心目标，为社会经济民生发展提供清晰路线图。李家超强调，此举旨在主动对接国家发展战略，巩固提升香港国际金融、航运、贸易中心地位，并全力建设国际创新科技中心及北部都会区</w:t>
+      </w:r>
     </w:p>
     <w:p>
       <w:pPr>
@@ -756,6 +1587,15 @@
           <w:szCs w:val="32"/>
         </w:rPr>
       </w:pPr>
+    </w:p>
+    <w:p>
+      <w:pPr>
+        <w:rPr>
+          <w:rFonts w:ascii="FangSong" w:eastAsia="FangSong" w:hAnsi="FangSong"/>
+          <w:color w:val="000000" w:themeColor="text1"/>
+          <w:sz w:val="28"/>
+        </w:rPr>
+      </w:pPr>
       <w:r>
         <w:rPr>
           <w:rFonts w:ascii="FangSong" w:eastAsia="FangSong" w:hAnsi="FangSong" w:hint="eastAsia"/>
@@ -770,49 +1610,645 @@
     </w:p>
     <w:p>
       <w:pPr>
+        <w:rPr>
+          <w:rFonts w:ascii="FangSong" w:eastAsia="FangSong" w:hAnsi="FangSong"/>
+          <w:b/>
+          <w:color w:val="A6A6A6" w:themeColor="background1" w:themeShade="A6"/>
+          <w:sz w:val="28"/>
+        </w:rPr>
+      </w:pPr>
+      <w:r>
+        <w:rPr>
+          <w:rFonts w:ascii="FangSong" w:eastAsia="FangSong" w:hAnsi="FangSong" w:hint="eastAsia"/>
+          <w:b/>
+          <w:color w:val="A6A6A6" w:themeColor="background1" w:themeShade="A6"/>
+          <w:sz w:val="28"/>
+        </w:rPr>
+        <w:t>低空经济</w:t>
+      </w:r>
+    </w:p>
+    <w:p>
+      <w:pPr>
+        <w:rPr>
+          <w:rFonts w:ascii="FangSong" w:eastAsia="FangSong" w:hAnsi="FangSong"/>
+          <w:b/>
+          <w:color w:val="000000" w:themeColor="text1"/>
+          <w:sz w:val="28"/>
+          <w:u w:val="single"/>
+        </w:rPr>
+      </w:pPr>
+      <w:r>
+        <w:rPr>
+          <w:rFonts w:ascii="FangSong" w:eastAsia="FangSong" w:hAnsi="FangSong" w:hint="eastAsia"/>
+          <w:b/>
+          <w:color w:val="000000" w:themeColor="text1"/>
+          <w:sz w:val="28"/>
+          <w:u w:val="single"/>
+        </w:rPr>
+        <w:t>二、</w:t>
+      </w:r>
+      <w:r>
+        <w:rPr>
+          <w:rFonts w:ascii="FangSong" w:eastAsia="FangSong" w:hAnsi="FangSong" w:hint="eastAsia"/>
+          <w:b/>
+          <w:color w:val="000000" w:themeColor="text1"/>
+          <w:sz w:val="28"/>
+          <w:u w:val="single"/>
+        </w:rPr>
+        <w:t>香港环宇低空获超 1 亿美元 A 轮融资，布局全球低空网络</w:t>
+      </w:r>
+    </w:p>
+    <w:p>
+      <w:pPr>
+        <w:rPr>
+          <w:rFonts w:ascii="FangSong" w:eastAsia="FangSong" w:hAnsi="FangSong"/>
+          <w:color w:val="000000" w:themeColor="text1"/>
+          <w:sz w:val="28"/>
+        </w:rPr>
+      </w:pPr>
+      <w:r>
+        <w:rPr>
+          <w:rFonts w:ascii="FangSong" w:eastAsia="FangSong" w:hAnsi="FangSong" w:hint="eastAsia"/>
+          <w:color w:val="000000" w:themeColor="text1"/>
+          <w:sz w:val="28"/>
+        </w:rPr>
+        <w:t>香港环宇低空运营科技宣布完成由 IDG 资本领投的 A 轮融资，金额超 1 亿美元，多家跨国产业资本跟投。该公司聚焦无人机物流、载人飞行器及低空交通管理，计划以香港为枢纽，拓展东南亚、中东等市场。全球低空经济 2025 年规模破万亿美元、年增速超 35%，香港凭借政策开放、金融与区位优势，正成为资本布局低空经济的核心节点。</w:t>
+      </w:r>
+    </w:p>
+    <w:p>
+      <w:pPr>
+        <w:rPr>
+          <w:rFonts w:ascii="FangSong" w:eastAsia="FangSong" w:hAnsi="FangSong"/>
+          <w:color w:val="000000" w:themeColor="text1"/>
+          <w:sz w:val="28"/>
+        </w:rPr>
+      </w:pPr>
+    </w:p>
+    <w:p>
+      <w:pPr>
+        <w:rPr>
+          <w:rFonts w:ascii="FangSong" w:eastAsia="FangSong" w:hAnsi="FangSong"/>
+          <w:b/>
+          <w:color w:val="A6A6A6" w:themeColor="background1" w:themeShade="A6"/>
+          <w:sz w:val="28"/>
+        </w:rPr>
+      </w:pPr>
+      <w:r>
+        <w:rPr>
+          <w:rFonts w:ascii="FangSong" w:eastAsia="FangSong" w:hAnsi="FangSong" w:hint="eastAsia"/>
+          <w:b/>
+          <w:color w:val="A6A6A6" w:themeColor="background1" w:themeShade="A6"/>
+          <w:sz w:val="28"/>
+        </w:rPr>
+        <w:t>香港施政治理</w:t>
+      </w:r>
+    </w:p>
+    <w:p>
+      <w:pPr>
+        <w:rPr>
+          <w:rFonts w:ascii="FangSong" w:eastAsia="FangSong" w:hAnsi="FangSong"/>
+          <w:b/>
+          <w:color w:val="000000" w:themeColor="text1"/>
+          <w:sz w:val="28"/>
+          <w:u w:val="single"/>
+        </w:rPr>
+      </w:pPr>
+      <w:r>
+        <w:rPr>
+          <w:rFonts w:ascii="FangSong" w:eastAsia="FangSong" w:hAnsi="FangSong" w:hint="eastAsia"/>
+          <w:b/>
+          <w:color w:val="000000" w:themeColor="text1"/>
+          <w:sz w:val="28"/>
+          <w:u w:val="single"/>
+        </w:rPr>
+        <w:t>三、</w:t>
+      </w:r>
+      <w:r>
+        <w:rPr>
+          <w:rFonts w:ascii="FangSong" w:eastAsia="FangSong" w:hAnsi="FangSong" w:hint="eastAsia"/>
+          <w:b/>
+          <w:color w:val="000000" w:themeColor="text1"/>
+          <w:sz w:val="28"/>
+          <w:u w:val="single"/>
+        </w:rPr>
+        <w:t>香港发布铁路标准并设审批组，北环线成本预计省 20%</w:t>
+      </w:r>
+    </w:p>
+    <w:p>
+      <w:pPr>
+        <w:rPr>
+          <w:rFonts w:ascii="FangSong" w:eastAsia="FangSong" w:hAnsi="FangSong"/>
+          <w:color w:val="000000" w:themeColor="text1"/>
+          <w:sz w:val="28"/>
+        </w:rPr>
+      </w:pPr>
+      <w:r>
+        <w:rPr>
+          <w:rFonts w:ascii="FangSong" w:eastAsia="FangSong" w:hAnsi="FangSong" w:hint="eastAsia"/>
+          <w:color w:val="000000" w:themeColor="text1"/>
+          <w:sz w:val="28"/>
+        </w:rPr>
+        <w:lastRenderedPageBreak/>
+        <w:t>2 月 23 日香港路政署公布《香港铁路标准》并成立铁路审批组，以加快新铁路项目推展。新标准首次将铁路设计、建造、营运等标准集合成册，在保留香港沿用标准基础上引入国标等多项标准。该标准将率先应用于北环线及港深西部铁路两个跨境项目，预计北环线建造成本节省 20% 并提早两年完成，体现香港铁路建设与内地标准接轨的趋势</w:t>
+      </w:r>
+    </w:p>
+    <w:p>
+      <w:pPr>
+        <w:rPr>
+          <w:rFonts w:ascii="FangSong" w:eastAsia="FangSong" w:hAnsi="FangSong"/>
+          <w:color w:val="000000" w:themeColor="text1"/>
+          <w:sz w:val="28"/>
+        </w:rPr>
+      </w:pPr>
+    </w:p>
+    <w:p>
+      <w:pPr>
+        <w:rPr>
+          <w:rFonts w:ascii="FangSong" w:eastAsia="FangSong" w:hAnsi="FangSong"/>
+          <w:b/>
+          <w:color w:val="A6A6A6" w:themeColor="background1" w:themeShade="A6"/>
+          <w:sz w:val="28"/>
+        </w:rPr>
+      </w:pPr>
+      <w:r>
+        <w:rPr>
+          <w:rFonts w:ascii="FangSong" w:eastAsia="FangSong" w:hAnsi="FangSong" w:hint="eastAsia"/>
+          <w:b/>
+          <w:color w:val="A6A6A6" w:themeColor="background1" w:themeShade="A6"/>
+          <w:sz w:val="28"/>
+        </w:rPr>
+        <w:t>人工智能</w:t>
+      </w:r>
+    </w:p>
+    <w:p>
+      <w:pPr>
+        <w:rPr>
+          <w:rFonts w:ascii="FangSong" w:eastAsia="FangSong" w:hAnsi="FangSong"/>
+          <w:b/>
+          <w:color w:val="000000" w:themeColor="text1"/>
+          <w:sz w:val="28"/>
+          <w:u w:val="single"/>
+        </w:rPr>
+      </w:pPr>
+      <w:r>
+        <w:rPr>
+          <w:rFonts w:ascii="FangSong" w:eastAsia="FangSong" w:hAnsi="FangSong" w:hint="eastAsia"/>
+          <w:b/>
+          <w:color w:val="000000" w:themeColor="text1"/>
+          <w:sz w:val="28"/>
+          <w:u w:val="single"/>
+        </w:rPr>
+        <w:t>四、</w:t>
+      </w:r>
+      <w:r>
+        <w:rPr>
+          <w:rFonts w:ascii="FangSong" w:eastAsia="FangSong" w:hAnsi="FangSong" w:hint="eastAsia"/>
+          <w:b/>
+          <w:color w:val="000000" w:themeColor="text1"/>
+          <w:sz w:val="28"/>
+          <w:u w:val="single"/>
+        </w:rPr>
+        <w:t>港澳首个共同资助联合实验室成立，聚焦机器人与具身智能</w:t>
+      </w:r>
+    </w:p>
+    <w:p>
+      <w:pPr>
+        <w:rPr>
+          <w:rFonts w:ascii="FangSong" w:eastAsia="FangSong" w:hAnsi="FangSong"/>
+          <w:color w:val="000000" w:themeColor="text1"/>
+          <w:sz w:val="28"/>
+        </w:rPr>
+      </w:pPr>
+      <w:r>
+        <w:rPr>
+          <w:rFonts w:ascii="FangSong" w:eastAsia="FangSong" w:hAnsi="FangSong" w:hint="eastAsia"/>
+          <w:color w:val="000000" w:themeColor="text1"/>
+          <w:sz w:val="28"/>
+        </w:rPr>
+        <w:t>澳门大学与香港理工大学在澳大签署协议，成立首个港澳两地共同资助的 “机器人与具身智能联合实验室”，并同步启动联合培养博士研究生双学位项目。该实验室将聚焦机器人与具身智能领域前沿研究，推动技术创新与产业转化。香港理工大学校长滕锦光表示，此次合作彰显双方共同愿景，将为大湾区乃至全球相关领域发展贡献力量。联合实验室的成立标志着港澳科研合作进入新阶段，将进一步提升两地在人工智能与机器人领域的科研实力。</w:t>
+      </w:r>
+    </w:p>
+    <w:p>
+      <w:pPr>
+        <w:rPr>
+          <w:rFonts w:ascii="FangSong" w:eastAsia="FangSong" w:hAnsi="FangSong"/>
+          <w:color w:val="000000" w:themeColor="text1"/>
+          <w:sz w:val="28"/>
+        </w:rPr>
+      </w:pPr>
+    </w:p>
+    <w:p>
+      <w:pPr>
+        <w:rPr>
+          <w:rFonts w:ascii="FangSong" w:eastAsia="FangSong" w:hAnsi="FangSong"/>
+          <w:b/>
+          <w:color w:val="A6A6A6" w:themeColor="background1" w:themeShade="A6"/>
+          <w:sz w:val="28"/>
+        </w:rPr>
+      </w:pPr>
+      <w:r>
+        <w:rPr>
+          <w:rFonts w:ascii="FangSong" w:eastAsia="FangSong" w:hAnsi="FangSong" w:hint="eastAsia"/>
+          <w:b/>
+          <w:color w:val="A6A6A6" w:themeColor="background1" w:themeShade="A6"/>
+          <w:sz w:val="28"/>
+        </w:rPr>
+        <w:t>八大中心</w:t>
+      </w:r>
+    </w:p>
+    <w:p>
+      <w:pPr>
+        <w:rPr>
+          <w:rFonts w:ascii="FangSong" w:eastAsia="FangSong" w:hAnsi="FangSong"/>
+          <w:b/>
+          <w:color w:val="000000" w:themeColor="text1"/>
+          <w:sz w:val="28"/>
+          <w:u w:val="single"/>
+        </w:rPr>
+      </w:pPr>
+      <w:r>
+        <w:rPr>
+          <w:rFonts w:ascii="FangSong" w:eastAsia="FangSong" w:hAnsi="FangSong" w:hint="eastAsia"/>
+          <w:b/>
+          <w:color w:val="000000" w:themeColor="text1"/>
+          <w:sz w:val="28"/>
+          <w:u w:val="single"/>
+        </w:rPr>
+        <w:t>五、</w:t>
+      </w:r>
+      <w:r>
+        <w:rPr>
+          <w:rFonts w:ascii="FangSong" w:eastAsia="FangSong" w:hAnsi="FangSong" w:hint="eastAsia"/>
+          <w:b/>
+          <w:color w:val="000000" w:themeColor="text1"/>
+          <w:sz w:val="28"/>
+          <w:u w:val="single"/>
+        </w:rPr>
+        <w:t>香港推出四大金融发展措施，巩固国际金融中心地位</w:t>
+      </w:r>
+    </w:p>
+    <w:p>
+      <w:pPr>
+        <w:rPr>
+          <w:rFonts w:ascii="FangSong" w:eastAsia="FangSong" w:hAnsi="FangSong"/>
+          <w:color w:val="000000" w:themeColor="text1"/>
+          <w:sz w:val="28"/>
+        </w:rPr>
+      </w:pPr>
+      <w:r>
+        <w:rPr>
+          <w:rFonts w:ascii="FangSong" w:eastAsia="FangSong" w:hAnsi="FangSong" w:hint="eastAsia"/>
+          <w:color w:val="000000" w:themeColor="text1"/>
+          <w:sz w:val="28"/>
+        </w:rPr>
+        <w:t>2 月 26 日香港财经事务及库务局局长许正宇公布金融发展四大措施，涵盖促改革、拓基建、增容量、建联通四大方向。将优化港交所上市规则、上半年完善结构性产品上市框架，年内建成数字资产平台；人民币业务资金安排总额度倍增至 2000 亿元人民币，优化基金和家族办公室优惠税制。同时深化大湾区</w:t>
+      </w:r>
+      <w:r>
+        <w:rPr>
+          <w:rFonts w:ascii="FangSong" w:eastAsia="FangSong" w:hAnsi="FangSong" w:hint="eastAsia"/>
+          <w:color w:val="000000" w:themeColor="text1"/>
+          <w:sz w:val="28"/>
+        </w:rPr>
+        <w:lastRenderedPageBreak/>
+        <w:t>金融合作，2026 年香港将首次承办亚太区经济合作组织财政部长会议，持续拓展金融合作网络。</w:t>
+      </w:r>
+    </w:p>
+    <w:p>
+      <w:pPr>
+        <w:rPr>
+          <w:rFonts w:ascii="FangSong" w:eastAsia="FangSong" w:hAnsi="FangSong"/>
+          <w:color w:val="000000" w:themeColor="text1"/>
+          <w:sz w:val="28"/>
+        </w:rPr>
+      </w:pPr>
+    </w:p>
+    <w:p>
+      <w:pPr>
+        <w:rPr>
+          <w:rFonts w:ascii="FangSong" w:eastAsia="FangSong" w:hAnsi="FangSong"/>
+          <w:b/>
+          <w:color w:val="A6A6A6" w:themeColor="background1" w:themeShade="A6"/>
+          <w:sz w:val="28"/>
+        </w:rPr>
+      </w:pPr>
+      <w:r>
+        <w:rPr>
+          <w:rFonts w:ascii="FangSong" w:eastAsia="FangSong" w:hAnsi="FangSong" w:hint="eastAsia"/>
+          <w:b/>
+          <w:color w:val="A6A6A6" w:themeColor="background1" w:themeShade="A6"/>
+          <w:sz w:val="28"/>
+        </w:rPr>
+        <w:t>漫游市场需求</w:t>
+      </w:r>
+    </w:p>
+    <w:p>
+      <w:pPr>
+        <w:rPr>
+          <w:rFonts w:ascii="FangSong" w:eastAsia="FangSong" w:hAnsi="FangSong"/>
+          <w:b/>
+          <w:color w:val="000000" w:themeColor="text1"/>
+          <w:sz w:val="28"/>
+          <w:u w:val="single"/>
+        </w:rPr>
+      </w:pPr>
+      <w:r>
+        <w:rPr>
+          <w:rFonts w:ascii="FangSong" w:eastAsia="FangSong" w:hAnsi="FangSong" w:hint="eastAsia"/>
+          <w:b/>
+          <w:color w:val="000000" w:themeColor="text1"/>
+          <w:sz w:val="28"/>
+          <w:u w:val="single"/>
+        </w:rPr>
+        <w:t>六、</w:t>
+      </w:r>
+      <w:r>
+        <w:rPr>
+          <w:rFonts w:ascii="FangSong" w:eastAsia="FangSong" w:hAnsi="FangSong" w:hint="eastAsia"/>
+          <w:b/>
+          <w:color w:val="000000" w:themeColor="text1"/>
+          <w:sz w:val="28"/>
+          <w:u w:val="single"/>
+        </w:rPr>
+        <w:t>香港新春旅游消费市场全面回暖，跨境便利成核心驱动力</w:t>
+      </w:r>
+    </w:p>
+    <w:p>
+      <w:pPr>
+        <w:rPr>
+          <w:rFonts w:ascii="FangSong" w:eastAsia="FangSong" w:hAnsi="FangSong"/>
+          <w:color w:val="000000" w:themeColor="text1"/>
+          <w:sz w:val="28"/>
+        </w:rPr>
+      </w:pPr>
+      <w:r>
+        <w:rPr>
+          <w:rFonts w:ascii="FangSong" w:eastAsia="FangSong" w:hAnsi="FangSong" w:hint="eastAsia"/>
+          <w:color w:val="000000" w:themeColor="text1"/>
+          <w:sz w:val="28"/>
+        </w:rPr>
+        <w:t>香港 2026 年新春旅游消费市场稳健复苏，各业态迎来显著增长。新春假期零售业销售额按年增约 18%，核心商圈金店内地旅客购买量占比超 8 成，文化零售地标客流及消费额分别涨 10%、60%；餐饮业生意额预计增 5%，热门餐厅均需提前预订；铜锣湾等核心区域酒店入住率超 90%。粤车南下、港车北上政策双向发力，港珠澳大桥新春访港客超 13.6 万人次，沙田赛马日入场逾 9.8 万人，内地及海外旅客超 2 万刷新纪录，特色活动与跨境便利成为复苏核心动力。</w:t>
+      </w:r>
+    </w:p>
+    <w:p>
+      <w:pPr>
+        <w:rPr>
+          <w:rFonts w:ascii="FangSong" w:eastAsia="FangSong" w:hAnsi="FangSong"/>
+          <w:b/>
+          <w:color w:val="A6A6A6" w:themeColor="background1" w:themeShade="A6"/>
+          <w:sz w:val="28"/>
+        </w:rPr>
+      </w:pPr>
+    </w:p>
+    <w:p>
+      <w:pPr>
+        <w:rPr>
+          <w:rFonts w:ascii="FangSong" w:eastAsia="FangSong" w:hAnsi="FangSong"/>
+          <w:b/>
+          <w:color w:val="A6A6A6" w:themeColor="background1" w:themeShade="A6"/>
+          <w:sz w:val="28"/>
+        </w:rPr>
+      </w:pPr>
+      <w:r>
+        <w:rPr>
+          <w:rFonts w:ascii="FangSong" w:eastAsia="FangSong" w:hAnsi="FangSong" w:hint="eastAsia"/>
+          <w:b/>
+          <w:color w:val="A6A6A6" w:themeColor="background1" w:themeShade="A6"/>
+          <w:sz w:val="28"/>
+        </w:rPr>
+        <w:t>香港施政治理</w:t>
+      </w:r>
+    </w:p>
+    <w:p>
+      <w:pPr>
+        <w:rPr>
+          <w:rFonts w:ascii="FangSong" w:eastAsia="FangSong" w:hAnsi="FangSong"/>
+          <w:b/>
+          <w:color w:val="000000" w:themeColor="text1"/>
+          <w:sz w:val="28"/>
+          <w:u w:val="single"/>
+        </w:rPr>
+      </w:pPr>
+      <w:r>
+        <w:rPr>
+          <w:rFonts w:ascii="FangSong" w:eastAsia="FangSong" w:hAnsi="FangSong" w:hint="eastAsia"/>
+          <w:b/>
+          <w:color w:val="000000" w:themeColor="text1"/>
+          <w:sz w:val="28"/>
+          <w:u w:val="single"/>
+        </w:rPr>
+        <w:t>七、</w:t>
+      </w:r>
+      <w:r>
+        <w:rPr>
+          <w:rFonts w:ascii="FangSong" w:eastAsia="FangSong" w:hAnsi="FangSong" w:hint="eastAsia"/>
+          <w:b/>
+          <w:color w:val="000000" w:themeColor="text1"/>
+          <w:sz w:val="28"/>
+          <w:u w:val="single"/>
+        </w:rPr>
+        <w:t>桂港举办合作推介会，携手拓展东盟多领域合作</w:t>
+      </w:r>
+    </w:p>
+    <w:p>
+      <w:pPr>
+        <w:rPr>
+          <w:rFonts w:ascii="FangSong" w:eastAsia="FangSong" w:hAnsi="FangSong"/>
+          <w:color w:val="000000" w:themeColor="text1"/>
+          <w:sz w:val="28"/>
+        </w:rPr>
+      </w:pPr>
+      <w:r>
+        <w:rPr>
+          <w:rFonts w:ascii="FangSong" w:eastAsia="FangSong" w:hAnsi="FangSong" w:hint="eastAsia"/>
+          <w:color w:val="000000" w:themeColor="text1"/>
+          <w:sz w:val="28"/>
+        </w:rPr>
+        <w:t>“东盟门户</w:t>
+      </w:r>
+      <w:r>
+        <w:rPr>
+          <w:rFonts w:ascii="Microsoft YaHei" w:eastAsia="Microsoft YaHei" w:hAnsi="Microsoft YaHei" w:cs="Microsoft YaHei" w:hint="eastAsia"/>
+          <w:color w:val="000000" w:themeColor="text1"/>
+          <w:sz w:val="28"/>
+        </w:rPr>
+        <w:t>・</w:t>
+      </w:r>
+      <w:r>
+        <w:rPr>
+          <w:rFonts w:ascii="FangSong" w:eastAsia="FangSong" w:hAnsi="FangSong" w:cs="FangSong" w:hint="eastAsia"/>
+          <w:color w:val="000000" w:themeColor="text1"/>
+          <w:sz w:val="28"/>
+        </w:rPr>
+        <w:t>湾区腹地</w:t>
+      </w:r>
+      <w:r>
+        <w:rPr>
+          <w:rFonts w:ascii="FangSong" w:eastAsia="FangSong" w:hAnsi="FangSong"/>
+          <w:color w:val="000000" w:themeColor="text1"/>
+          <w:sz w:val="28"/>
+        </w:rPr>
+        <w:t xml:space="preserve"> —2026 </w:t>
+      </w:r>
+      <w:r>
+        <w:rPr>
+          <w:rFonts w:ascii="FangSong" w:eastAsia="FangSong" w:hAnsi="FangSong" w:hint="eastAsia"/>
+          <w:color w:val="000000" w:themeColor="text1"/>
+          <w:sz w:val="28"/>
+        </w:rPr>
+        <w:t>广西（香港）推介会”</w:t>
+      </w:r>
+      <w:r>
+        <w:rPr>
+          <w:rFonts w:ascii="FangSong" w:eastAsia="FangSong" w:hAnsi="FangSong"/>
+          <w:color w:val="000000" w:themeColor="text1"/>
+          <w:sz w:val="28"/>
+        </w:rPr>
+        <w:t xml:space="preserve"> </w:t>
+      </w:r>
+      <w:r>
+        <w:rPr>
+          <w:rFonts w:ascii="FangSong" w:eastAsia="FangSong" w:hAnsi="FangSong" w:hint="eastAsia"/>
+          <w:color w:val="000000" w:themeColor="text1"/>
+          <w:sz w:val="28"/>
+        </w:rPr>
+        <w:t>在港举办，李家超与广西相关领导出席并致辞。香港作为广西最大外资来源地，此次与广西签署青年交流、人工智能合作等多份备忘录，共签约</w:t>
+      </w:r>
+      <w:r>
+        <w:rPr>
+          <w:rFonts w:ascii="FangSong" w:eastAsia="FangSong" w:hAnsi="FangSong"/>
+          <w:color w:val="000000" w:themeColor="text1"/>
+          <w:sz w:val="28"/>
+        </w:rPr>
+        <w:t xml:space="preserve"> 24 </w:t>
+      </w:r>
+      <w:r>
+        <w:rPr>
+          <w:rFonts w:ascii="FangSong" w:eastAsia="FangSong" w:hAnsi="FangSong" w:hint="eastAsia"/>
+          <w:color w:val="000000" w:themeColor="text1"/>
+          <w:sz w:val="28"/>
+        </w:rPr>
+        <w:t>个涉及</w:t>
+      </w:r>
+      <w:r>
+        <w:rPr>
+          <w:rFonts w:ascii="FangSong" w:eastAsia="FangSong" w:hAnsi="FangSong"/>
+          <w:color w:val="000000" w:themeColor="text1"/>
+          <w:sz w:val="28"/>
+        </w:rPr>
+        <w:t xml:space="preserve"> AI</w:t>
+      </w:r>
+      <w:r>
+        <w:rPr>
+          <w:rFonts w:ascii="FangSong" w:eastAsia="FangSong" w:hAnsi="FangSong" w:hint="eastAsia"/>
+          <w:color w:val="000000" w:themeColor="text1"/>
+          <w:sz w:val="28"/>
+        </w:rPr>
+        <w:t>、跨境金融、园区合作的项目。双方拟共建中国</w:t>
+      </w:r>
+      <w:r>
+        <w:rPr>
+          <w:rFonts w:ascii="FangSong" w:eastAsia="FangSong" w:hAnsi="FangSong"/>
+          <w:color w:val="000000" w:themeColor="text1"/>
+          <w:sz w:val="28"/>
+        </w:rPr>
+        <w:t xml:space="preserve"> — </w:t>
+      </w:r>
+      <w:r>
+        <w:rPr>
+          <w:rFonts w:ascii="FangSong" w:eastAsia="FangSong" w:hAnsi="FangSong" w:hint="eastAsia"/>
+          <w:color w:val="000000" w:themeColor="text1"/>
+          <w:sz w:val="28"/>
+        </w:rPr>
+        <w:t>东盟人工智能应用合作中心，深化港口物流、临港产业合作，香港还将依托平陆运河通航契机，与广西拓展绿色航运走廊建设，携手开拓东盟市场。</w:t>
+      </w:r>
+    </w:p>
+    <w:p>
+      <w:pPr>
+        <w:rPr>
+          <w:rFonts w:ascii="FangSong" w:eastAsia="FangSong" w:hAnsi="FangSong"/>
+          <w:b/>
+          <w:color w:val="A6A6A6" w:themeColor="background1" w:themeShade="A6"/>
+          <w:sz w:val="28"/>
+        </w:rPr>
+      </w:pPr>
+      <w:r>
+        <w:rPr>
+          <w:rFonts w:ascii="FangSong" w:eastAsia="FangSong" w:hAnsi="FangSong"/>
+          <w:b/>
+          <w:color w:val="A6A6A6" w:themeColor="background1" w:themeShade="A6"/>
+          <w:sz w:val="28"/>
+        </w:rPr>
+        <w:lastRenderedPageBreak/>
+        <w:t>Web3.0</w:t>
+      </w:r>
+    </w:p>
+    <w:p>
+      <w:pPr>
+        <w:rPr>
+          <w:rFonts w:ascii="FangSong" w:eastAsia="FangSong" w:hAnsi="FangSong"/>
+          <w:b/>
+          <w:color w:val="000000" w:themeColor="text1"/>
+          <w:sz w:val="28"/>
+          <w:u w:val="single"/>
+        </w:rPr>
+      </w:pPr>
+      <w:r>
+        <w:rPr>
+          <w:rFonts w:ascii="FangSong" w:eastAsia="FangSong" w:hAnsi="FangSong" w:hint="eastAsia"/>
+          <w:b/>
+          <w:color w:val="000000" w:themeColor="text1"/>
+          <w:sz w:val="28"/>
+          <w:u w:val="single"/>
+        </w:rPr>
+        <w:t>八、</w:t>
+      </w:r>
+      <w:r>
+        <w:rPr>
+          <w:rFonts w:ascii="FangSong" w:eastAsia="FangSong" w:hAnsi="FangSong" w:hint="eastAsia"/>
+          <w:b/>
+          <w:color w:val="000000" w:themeColor="text1"/>
+          <w:sz w:val="28"/>
+          <w:u w:val="single"/>
+        </w:rPr>
+        <w:t>香港拟3月发出首批法币稳定币牌照，并将提交数字资产政策法案</w:t>
+      </w:r>
+    </w:p>
+    <w:bookmarkEnd w:id="4"/>
+    <w:bookmarkEnd w:id="5"/>
+    <w:bookmarkEnd w:id="6"/>
+    <w:bookmarkEnd w:id="7"/>
+    <w:p>
+      <w:pPr>
         <w:widowControl/>
+        <w:jc w:val="left"/>
         <w:rPr>
           <w:rFonts w:ascii="FangSong" w:eastAsia="FangSong" w:hAnsi="FangSong"/>
-          <w:b/>
-          <w:color w:val="A6A6A6" w:themeColor="background1" w:themeShade="A6"/>
-          <w:sz w:val="28"/>
-        </w:rPr>
-      </w:pPr>
-      <w:r>
-        <w:rPr>
-          <w:rFonts w:ascii="FangSong" w:eastAsia="FangSong" w:hAnsi="FangSong" w:hint="eastAsia"/>
-          <w:b/>
-          <w:color w:val="A6A6A6" w:themeColor="background1" w:themeShade="A6"/>
-          <w:sz w:val="28"/>
-        </w:rPr>
-        <w:t>标签</w:t>
+          <w:color w:val="000000" w:themeColor="text1"/>
+          <w:sz w:val="28"/>
+        </w:rPr>
+      </w:pPr>
+      <w:r>
+        <w:rPr>
+          <w:rFonts w:ascii="FangSong" w:eastAsia="FangSong" w:hAnsi="FangSong" w:hint="eastAsia"/>
+          <w:color w:val="000000" w:themeColor="text1"/>
+          <w:sz w:val="28"/>
+        </w:rPr>
+        <w:t>财政司司长陈茂波在《财政预算案2026》中表示，政府将于年内向立法会提交数字资产政策条例草案，为数字资产交易及托管等服务提供者订立发牌制度。目前，香港已实施法币稳定币发行人发牌制度，预计在3月向合规发行人发出首批牌照。未来，证监会将在保障投资者的前提下，通过建立加速器等方式推动市场创新，并促进持牌发行人在合规框架下探索更多数字资产的应用场景</w:t>
       </w:r>
     </w:p>
     <w:p>
       <w:pPr>
         <w:widowControl/>
+        <w:jc w:val="left"/>
         <w:rPr>
           <w:rFonts w:ascii="FangSong" w:eastAsia="FangSong" w:hAnsi="FangSong"/>
-          <w:b/>
-          <w:color w:val="000000" w:themeColor="text1"/>
-          <w:sz w:val="28"/>
-          <w:u w:val="single"/>
-        </w:rPr>
-      </w:pPr>
-      <w:r>
-        <w:rPr>
-          <w:rFonts w:ascii="FangSong" w:eastAsia="FangSong" w:hAnsi="FangSong" w:hint="eastAsia"/>
-          <w:b/>
-          <w:color w:val="000000" w:themeColor="text1"/>
-          <w:sz w:val="28"/>
-          <w:u w:val="single"/>
-        </w:rPr>
-        <w:t>二、一句话事件标题</w:t>
-      </w:r>
-    </w:p>
-    <w:p>
-      <w:pPr>
-        <w:widowControl/>
+          <w:color w:val="000000" w:themeColor="text1"/>
+          <w:sz w:val="28"/>
+        </w:rPr>
+      </w:pPr>
+    </w:p>
+    <w:p>
+      <w:pPr>
         <w:rPr>
           <w:rFonts w:ascii="FangSong" w:eastAsia="FangSong" w:hAnsi="FangSong"/>
           <w:color w:val="000000" w:themeColor="text1"/>
@@ -822,34 +2258,14 @@
       <w:r>
         <w:rPr>
           <w:rFonts w:ascii="FangSong" w:eastAsia="FangSong" w:hAnsi="FangSong" w:hint="eastAsia"/>
-          <w:color w:val="000000" w:themeColor="text1"/>
-          <w:sz w:val="28"/>
-        </w:rPr>
-        <w:t>事件事实正文。只写公开来源可复核事实，不写爬虫运行过程。</w:t>
-      </w:r>
-    </w:p>
-    <w:p>
-      <w:pPr>
-        <w:widowControl/>
-        <w:rPr>
-          <w:rFonts w:ascii="FangSong" w:eastAsia="FangSong" w:hAnsi="FangSong"/>
-          <w:color w:val="000000" w:themeColor="text1"/>
-          <w:sz w:val="28"/>
-        </w:rPr>
-      </w:pPr>
-    </w:p>
-    <w:p>
-      <w:pPr>
-        <w:widowControl/>
-        <w:rPr>
-          <w:rFonts w:ascii="FangSong" w:eastAsia="FangSong" w:hAnsi="FangSong"/>
           <w:b/>
           <w:bCs/>
           <w:color w:val="4472C4" w:themeColor="accent1"/>
           <w:sz w:val="44"/>
           <w:szCs w:val="32"/>
         </w:rPr>
-      </w:pPr>
+        <w:t>社会</w:t>
+      </w:r>
       <w:r>
         <w:rPr>
           <w:rFonts w:ascii="FangSong" w:eastAsia="FangSong" w:hAnsi="FangSong" w:hint="eastAsia"/>
@@ -859,12 +2275,13 @@
           <w:sz w:val="44"/>
           <w:szCs w:val="32"/>
         </w:rPr>
-        <w:t>社会资讯</w:t>
+        <w:t>资讯</w:t>
       </w:r>
     </w:p>
     <w:p>
       <w:pPr>
         <w:widowControl/>
+        <w:jc w:val="left"/>
         <w:rPr>
           <w:rFonts w:ascii="FangSong" w:eastAsia="FangSong" w:hAnsi="FangSong"/>
           <w:b/>
@@ -879,12 +2296,13 @@
           <w:color w:val="A6A6A6" w:themeColor="background1" w:themeShade="A6"/>
           <w:sz w:val="28"/>
         </w:rPr>
-        <w:t>标签</w:t>
+        <w:t>本地生活</w:t>
       </w:r>
     </w:p>
     <w:p>
       <w:pPr>
         <w:widowControl/>
+        <w:jc w:val="left"/>
         <w:rPr>
           <w:rFonts w:ascii="FangSong" w:eastAsia="FangSong" w:hAnsi="FangSong"/>
           <w:b/>
@@ -901,7 +2319,17 @@
           <w:sz w:val="28"/>
           <w:u w:val="single"/>
         </w:rPr>
-        <w:t>三、一句话事件标题</w:t>
+        <w:t>九、</w:t>
+      </w:r>
+      <w:r>
+        <w:rPr>
+          <w:rFonts w:ascii="FangSong" w:eastAsia="FangSong" w:hAnsi="FangSong" w:hint="eastAsia"/>
+          <w:b/>
+          <w:color w:val="000000" w:themeColor="text1"/>
+          <w:sz w:val="28"/>
+          <w:u w:val="single"/>
+        </w:rPr>
+        <w:t>香港公屋轮候机制持续优化，综合轮候时间维持近年低位</w:t>
       </w:r>
     </w:p>
     <w:p>
@@ -919,236 +2347,62 @@
           <w:color w:val="000000" w:themeColor="text1"/>
           <w:sz w:val="28"/>
         </w:rPr>
-        <w:t>事件事实正文。只写公开来源可复核事实，不写爬虫运行过程。</w:t>
+        <w:t>香港房屋局公布数据，截至 2025 年 12 月底公屋综合轮候时间维持 5.1 年，为 2018 年一季度以来最低，较本届政府上任前高位缩短 1 年。2025 年全年超 2 万个一般申请者获编配传统公屋，第四季更有 8800 人入住传统公屋或简约公屋，其中简约公屋申请者平均轮候时间仅 3.2 年，成为缩短轮候时长的关键。目前一般公屋申请数较峰值降超 30%，政府仍将推进建屋计划，力争 2026/27 年度将综合轮候时间降至 4.5 年。</w:t>
       </w:r>
     </w:p>
     <w:p>
       <w:pPr>
         <w:widowControl/>
+        <w:jc w:val="left"/>
         <w:rPr>
           <w:rFonts w:ascii="FangSong" w:eastAsia="FangSong" w:hAnsi="FangSong"/>
-          <w:color w:val="000000" w:themeColor="text1"/>
-          <w:sz w:val="28"/>
-        </w:rPr>
-      </w:pPr>
-    </w:p>
-    <w:p>
-      <w:pPr>
-        <w:widowControl/>
+          <w:b/>
+          <w:color w:val="A6A6A6" w:themeColor="background1" w:themeShade="A6"/>
+          <w:sz w:val="28"/>
+        </w:rPr>
+      </w:pPr>
+    </w:p>
+    <w:p>
+      <w:pPr>
         <w:rPr>
           <w:rFonts w:ascii="FangSong" w:eastAsia="FangSong" w:hAnsi="FangSong"/>
+          <w:color w:val="000000" w:themeColor="text1"/>
+          <w:sz w:val="28"/>
+        </w:rPr>
+      </w:pPr>
+      <w:r>
+        <w:rPr>
+          <w:rFonts w:ascii="FangSong" w:eastAsia="FangSong" w:hAnsi="FangSong" w:hint="eastAsia"/>
           <w:b/>
           <w:bCs/>
           <w:color w:val="4472C4" w:themeColor="accent1"/>
           <w:sz w:val="44"/>
           <w:szCs w:val="32"/>
         </w:rPr>
-      </w:pPr>
-      <w:r>
-        <w:rPr>
-          <w:rFonts w:ascii="FangSong" w:eastAsia="FangSong" w:hAnsi="FangSong" w:hint="eastAsia"/>
-          <w:b/>
-          <w:bCs/>
-          <w:color w:val="4472C4" w:themeColor="accent1"/>
-          <w:sz w:val="44"/>
-          <w:szCs w:val="32"/>
-        </w:rPr>
         <w:t>国际资讯</w:t>
       </w:r>
     </w:p>
-    <w:p>
-      <w:pPr>
-        <w:widowControl/>
-        <w:rPr>
-          <w:rFonts w:ascii="FangSong" w:eastAsia="FangSong" w:hAnsi="FangSong"/>
-          <w:b/>
-          <w:color w:val="A6A6A6" w:themeColor="background1" w:themeShade="A6"/>
-          <w:sz w:val="28"/>
-        </w:rPr>
-      </w:pPr>
-      <w:r>
-        <w:rPr>
-          <w:rFonts w:ascii="FangSong" w:eastAsia="FangSong" w:hAnsi="FangSong" w:hint="eastAsia"/>
-          <w:b/>
-          <w:color w:val="A6A6A6" w:themeColor="background1" w:themeShade="A6"/>
-          <w:sz w:val="28"/>
-        </w:rPr>
-        <w:t>标签</w:t>
-      </w:r>
-    </w:p>
-    <w:p>
-      <w:pPr>
-        <w:widowControl/>
-        <w:rPr>
-          <w:rFonts w:ascii="FangSong" w:eastAsia="FangSong" w:hAnsi="FangSong"/>
-          <w:b/>
-          <w:color w:val="000000" w:themeColor="text1"/>
-          <w:sz w:val="28"/>
-          <w:u w:val="single"/>
-        </w:rPr>
-      </w:pPr>
-      <w:r>
-        <w:rPr>
-          <w:rFonts w:ascii="FangSong" w:eastAsia="FangSong" w:hAnsi="FangSong" w:hint="eastAsia"/>
-          <w:b/>
-          <w:color w:val="000000" w:themeColor="text1"/>
-          <w:sz w:val="28"/>
-          <w:u w:val="single"/>
-        </w:rPr>
-        <w:t>四、一句话事件标题</w:t>
-      </w:r>
-    </w:p>
-    <w:p>
-      <w:pPr>
-        <w:widowControl/>
-        <w:rPr>
-          <w:rFonts w:ascii="FangSong" w:eastAsia="FangSong" w:hAnsi="FangSong"/>
-          <w:color w:val="000000" w:themeColor="text1"/>
-          <w:sz w:val="28"/>
-        </w:rPr>
-      </w:pPr>
-      <w:r>
-        <w:rPr>
-          <w:rFonts w:ascii="FangSong" w:eastAsia="FangSong" w:hAnsi="FangSong" w:hint="eastAsia"/>
-          <w:color w:val="000000" w:themeColor="text1"/>
-          <w:sz w:val="28"/>
-        </w:rPr>
-        <w:t>事件事实正文。只写公开来源可复核事实，不写爬虫运行过程。</w:t>
-      </w:r>
-    </w:p>
-    <w:p>
-      <w:pPr>
-        <w:widowControl/>
-        <w:rPr>
-          <w:rFonts w:ascii="FangSong" w:eastAsia="FangSong" w:hAnsi="FangSong"/>
-          <w:color w:val="000000" w:themeColor="text1"/>
-          <w:sz w:val="28"/>
-        </w:rPr>
-      </w:pPr>
-    </w:p>
-    <w:p>
-      <w:pPr>
-        <w:rPr>
-          <w:rFonts w:ascii="FangSong" w:eastAsia="FangSong" w:hAnsi="FangSong"/>
-          <w:color w:val="000000" w:themeColor="text1"/>
-          <w:sz w:val="28"/>
-        </w:rPr>
-      </w:pPr>
-    </w:p>
-    <w:p>
-      <w:pPr>
-        <w:rPr>
-          <w:rFonts w:ascii="FangSong" w:eastAsia="FangSong" w:hAnsi="FangSong"/>
-          <w:color w:val="000000" w:themeColor="text1"/>
-          <w:sz w:val="28"/>
-        </w:rPr>
-      </w:pPr>
-    </w:p>
-    <w:p>
-      <w:pPr>
-        <w:rPr>
-          <w:rFonts w:ascii="FangSong" w:eastAsia="FangSong" w:hAnsi="FangSong"/>
-          <w:b/>
-          <w:color w:val="A6A6A6" w:themeColor="background1" w:themeShade="A6"/>
-          <w:sz w:val="28"/>
-        </w:rPr>
-      </w:pPr>
-    </w:p>
-    <w:p>
-      <w:pPr>
-        <w:rPr>
-          <w:rFonts w:ascii="FangSong" w:eastAsia="FangSong" w:hAnsi="FangSong"/>
-          <w:b/>
-          <w:color w:val="000000" w:themeColor="text1"/>
-          <w:sz w:val="28"/>
-          <w:u w:val="single"/>
-        </w:rPr>
-      </w:pPr>
-    </w:p>
-    <w:p>
-      <w:pPr>
-        <w:rPr>
-          <w:rFonts w:ascii="FangSong" w:eastAsia="FangSong" w:hAnsi="FangSong"/>
-          <w:color w:val="000000" w:themeColor="text1"/>
-          <w:sz w:val="28"/>
-        </w:rPr>
-      </w:pPr>
-    </w:p>
-    <w:p>
-      <w:pPr>
-        <w:rPr>
-          <w:rFonts w:ascii="FangSong" w:eastAsia="FangSong" w:hAnsi="FangSong"/>
-          <w:b/>
-          <w:color w:val="A6A6A6" w:themeColor="background1" w:themeShade="A6"/>
-          <w:sz w:val="28"/>
-        </w:rPr>
-      </w:pPr>
-    </w:p>
-    <w:p>
-      <w:pPr>
-        <w:rPr>
-          <w:rFonts w:ascii="FangSong" w:eastAsia="FangSong" w:hAnsi="FangSong"/>
-          <w:b/>
-          <w:color w:val="A6A6A6" w:themeColor="background1" w:themeShade="A6"/>
-          <w:sz w:val="28"/>
-        </w:rPr>
-      </w:pPr>
-    </w:p>
-    <w:p>
-      <w:pPr>
-        <w:rPr>
-          <w:rFonts w:ascii="FangSong" w:eastAsia="FangSong" w:hAnsi="FangSong"/>
-          <w:b/>
-          <w:color w:val="000000" w:themeColor="text1"/>
-          <w:sz w:val="28"/>
-          <w:u w:val="single"/>
-        </w:rPr>
-      </w:pPr>
-    </w:p>
-    <w:p>
-      <w:pPr>
-        <w:rPr>
-          <w:rFonts w:ascii="FangSong" w:eastAsia="FangSong" w:hAnsi="FangSong"/>
-          <w:color w:val="000000" w:themeColor="text1"/>
-          <w:sz w:val="28"/>
-        </w:rPr>
-      </w:pPr>
-    </w:p>
-    <w:p>
-      <w:pPr>
-        <w:rPr>
-          <w:rFonts w:ascii="FangSong" w:eastAsia="FangSong" w:hAnsi="FangSong"/>
-          <w:b/>
-          <w:color w:val="A6A6A6" w:themeColor="background1" w:themeShade="A6"/>
-          <w:sz w:val="28"/>
-        </w:rPr>
-      </w:pPr>
-    </w:p>
-    <w:p>
-      <w:pPr>
-        <w:rPr>
-          <w:rFonts w:ascii="FangSong" w:eastAsia="FangSong" w:hAnsi="FangSong"/>
-          <w:b/>
-          <w:color w:val="000000" w:themeColor="text1"/>
-          <w:sz w:val="28"/>
-          <w:u w:val="single"/>
-        </w:rPr>
-      </w:pPr>
-    </w:p>
-    <w:bookmarkEnd w:id="4"/>
-    <w:bookmarkEnd w:id="5"/>
-    <w:bookmarkEnd w:id="6"/>
-    <w:bookmarkEnd w:id="7"/>
     <w:p>
       <w:pPr>
         <w:widowControl/>
         <w:jc w:val="left"/>
         <w:rPr>
           <w:rFonts w:ascii="FangSong" w:eastAsia="FangSong" w:hAnsi="FangSong"/>
-          <w:color w:val="000000" w:themeColor="text1"/>
-          <w:sz w:val="28"/>
-        </w:rPr>
-      </w:pPr>
+          <w:b/>
+          <w:color w:val="A6A6A6" w:themeColor="background1" w:themeShade="A6"/>
+          <w:sz w:val="28"/>
+        </w:rPr>
+      </w:pPr>
+      <w:bookmarkStart w:id="8" w:name="OLE_LINK10"/>
+      <w:r>
+        <w:rPr>
+          <w:rFonts w:ascii="FangSong" w:eastAsia="FangSong" w:hAnsi="FangSong" w:hint="eastAsia"/>
+          <w:b/>
+          <w:color w:val="A6A6A6" w:themeColor="background1" w:themeShade="A6"/>
+          <w:sz w:val="28"/>
+        </w:rPr>
+        <w:t>地缘政治与经济</w:t>
+      </w:r>
     </w:p>
     <w:p>
       <w:pPr>
@@ -1156,19 +2410,52 @@
         <w:jc w:val="left"/>
         <w:rPr>
           <w:rFonts w:ascii="FangSong" w:eastAsia="FangSong" w:hAnsi="FangSong"/>
-          <w:color w:val="000000" w:themeColor="text1"/>
-          <w:sz w:val="28"/>
-        </w:rPr>
-      </w:pPr>
-    </w:p>
-    <w:p>
-      <w:pPr>
+          <w:b/>
+          <w:color w:val="000000" w:themeColor="text1"/>
+          <w:sz w:val="28"/>
+          <w:u w:val="single"/>
+        </w:rPr>
+      </w:pPr>
+      <w:r>
+        <w:rPr>
+          <w:rFonts w:ascii="FangSong" w:eastAsia="FangSong" w:hAnsi="FangSong" w:hint="eastAsia"/>
+          <w:b/>
+          <w:color w:val="000000" w:themeColor="text1"/>
+          <w:sz w:val="28"/>
+          <w:u w:val="single"/>
+        </w:rPr>
+        <w:lastRenderedPageBreak/>
+        <w:t>十、</w:t>
+      </w:r>
+      <w:r>
+        <w:rPr>
+          <w:rFonts w:ascii="FangSong" w:eastAsia="FangSong" w:hAnsi="FangSong" w:hint="eastAsia"/>
+          <w:b/>
+          <w:color w:val="000000" w:themeColor="text1"/>
+          <w:sz w:val="28"/>
+          <w:u w:val="single"/>
+        </w:rPr>
+        <w:t>中资在新加坡固定资产投资激增八倍，首次超过美国</w:t>
+      </w:r>
+    </w:p>
+    <w:bookmarkEnd w:id="8"/>
+    <w:p>
+      <w:pPr>
+        <w:widowControl/>
         <w:rPr>
           <w:rFonts w:ascii="FangSong" w:eastAsia="FangSong" w:hAnsi="FangSong"/>
           <w:color w:val="000000" w:themeColor="text1"/>
           <w:sz w:val="28"/>
         </w:rPr>
       </w:pPr>
+      <w:r>
+        <w:rPr>
+          <w:rFonts w:ascii="FangSong" w:eastAsia="FangSong" w:hAnsi="FangSong" w:hint="eastAsia"/>
+          <w:color w:val="000000" w:themeColor="text1"/>
+          <w:sz w:val="28"/>
+        </w:rPr>
+        <w:t>新加坡经济发展局发布数据显示，2025年新加坡固定资产投资承诺总额达142亿新加坡元，同比增长5.2%。其中，中资占比大幅提升，来自中国的固定资产投资承诺较2024年激增八倍，首次超过美国成为新加坡最大的外部投资来源国。新加坡经发局表示，尽管面临地缘政治和经济不确定性，来自各行各业的中国投资者对新加坡的承诺依然强劲，推动了整体投资数据的增长。</w:t>
+      </w:r>
     </w:p>
     <w:p>
       <w:pPr>
@@ -1176,8 +2463,7 @@
         <w:jc w:val="left"/>
         <w:rPr>
           <w:rFonts w:ascii="FangSong" w:eastAsia="FangSong" w:hAnsi="FangSong"/>
-          <w:b/>
-          <w:color w:val="A6A6A6" w:themeColor="background1" w:themeShade="A6"/>
+          <w:color w:val="000000" w:themeColor="text1"/>
           <w:sz w:val="28"/>
         </w:rPr>
       </w:pPr>
@@ -1189,21 +2475,19 @@
         <w:rPr>
           <w:rFonts w:ascii="FangSong" w:eastAsia="FangSong" w:hAnsi="FangSong"/>
           <w:b/>
-          <w:color w:val="000000" w:themeColor="text1"/>
-          <w:sz w:val="28"/>
-          <w:u w:val="single"/>
-        </w:rPr>
-      </w:pPr>
-    </w:p>
-    <w:p>
-      <w:pPr>
-        <w:widowControl/>
-        <w:rPr>
-          <w:rFonts w:ascii="FangSong" w:eastAsia="FangSong" w:hAnsi="FangSong"/>
-          <w:color w:val="000000" w:themeColor="text1"/>
-          <w:sz w:val="28"/>
-        </w:rPr>
-      </w:pPr>
+          <w:color w:val="A6A6A6" w:themeColor="background1" w:themeShade="A6"/>
+          <w:sz w:val="28"/>
+        </w:rPr>
+      </w:pPr>
+      <w:r>
+        <w:rPr>
+          <w:rFonts w:ascii="FangSong" w:eastAsia="FangSong" w:hAnsi="FangSong" w:hint="eastAsia"/>
+          <w:b/>
+          <w:color w:val="A6A6A6" w:themeColor="background1" w:themeShade="A6"/>
+          <w:sz w:val="28"/>
+        </w:rPr>
+        <w:t>人工智能</w:t>
+      </w:r>
     </w:p>
     <w:p>
       <w:pPr>
@@ -1212,19 +2496,49 @@
         <w:rPr>
           <w:rFonts w:ascii="FangSong" w:eastAsia="FangSong" w:hAnsi="FangSong"/>
           <w:b/>
-          <w:color w:val="A6A6A6" w:themeColor="background1" w:themeShade="A6"/>
-          <w:sz w:val="28"/>
-        </w:rPr>
-      </w:pPr>
-    </w:p>
-    <w:p>
-      <w:pPr>
+          <w:color w:val="000000" w:themeColor="text1"/>
+          <w:sz w:val="28"/>
+          <w:u w:val="single"/>
+        </w:rPr>
+      </w:pPr>
+      <w:r>
+        <w:rPr>
+          <w:rFonts w:ascii="FangSong" w:eastAsia="FangSong" w:hAnsi="FangSong" w:hint="eastAsia"/>
+          <w:b/>
+          <w:color w:val="000000" w:themeColor="text1"/>
+          <w:sz w:val="28"/>
+          <w:u w:val="single"/>
+        </w:rPr>
+        <w:t>十一、</w:t>
+      </w:r>
+      <w:r>
+        <w:rPr>
+          <w:rFonts w:ascii="FangSong" w:eastAsia="FangSong" w:hAnsi="FangSong" w:hint="eastAsia"/>
+          <w:b/>
+          <w:color w:val="000000" w:themeColor="text1"/>
+          <w:sz w:val="28"/>
+          <w:u w:val="single"/>
+        </w:rPr>
+        <w:t>全球半导体销售额预计今年达1万亿美元，AI成主要驱动力</w:t>
+      </w:r>
+    </w:p>
+    <w:p>
+      <w:pPr>
+        <w:widowControl/>
         <w:rPr>
           <w:rFonts w:ascii="FangSong" w:eastAsia="FangSong" w:hAnsi="FangSong"/>
           <w:color w:val="000000" w:themeColor="text1"/>
           <w:sz w:val="28"/>
         </w:rPr>
       </w:pPr>
+      <w:r>
+        <w:rPr>
+          <w:rFonts w:ascii="FangSong" w:eastAsia="FangSong" w:hAnsi="FangSong" w:hint="eastAsia"/>
+          <w:color w:val="000000" w:themeColor="text1"/>
+          <w:sz w:val="28"/>
+        </w:rPr>
+        <w:t>美国半导体行业协会（SIA）表示，在人工智能、物联网、6G和自动驾驶技术需求的推动下，全球芯片销售额预计将在2026年达到1万亿美元。数据显示，2025年全球半导体行业销售额达7917亿美元，同比增长25.6%，创下历史新高。SIA总裁兼首席执行官约翰·诺伊弗指出，半导体正推动当今及未来的变革性技术，美国需优先制定政策以加强本土芯片生态系统，确保其在全球技术竞赛中的领导地位。</w:t>
+      </w:r>
     </w:p>
     <w:p>
       <w:pPr>
@@ -1245,22 +2559,19 @@
         <w:rPr>
           <w:rFonts w:ascii="FangSong" w:eastAsia="FangSong" w:hAnsi="FangSong"/>
           <w:b/>
-          <w:color w:val="000000" w:themeColor="text1"/>
-          <w:sz w:val="28"/>
-          <w:u w:val="single"/>
-        </w:rPr>
-      </w:pPr>
-    </w:p>
-    <w:bookmarkEnd w:id="8"/>
-    <w:p>
-      <w:pPr>
-        <w:widowControl/>
-        <w:rPr>
-          <w:rFonts w:ascii="FangSong" w:eastAsia="FangSong" w:hAnsi="FangSong"/>
-          <w:color w:val="000000" w:themeColor="text1"/>
-          <w:sz w:val="28"/>
-        </w:rPr>
-      </w:pPr>
+          <w:color w:val="A6A6A6" w:themeColor="background1" w:themeShade="A6"/>
+          <w:sz w:val="28"/>
+        </w:rPr>
+      </w:pPr>
+      <w:r>
+        <w:rPr>
+          <w:rFonts w:ascii="FangSong" w:eastAsia="FangSong" w:hAnsi="FangSong" w:hint="eastAsia"/>
+          <w:b/>
+          <w:color w:val="A6A6A6" w:themeColor="background1" w:themeShade="A6"/>
+          <w:sz w:val="28"/>
+        </w:rPr>
+        <w:t>友商动态</w:t>
+      </w:r>
     </w:p>
     <w:p>
       <w:pPr>
@@ -1268,10 +2579,135 @@
         <w:jc w:val="left"/>
         <w:rPr>
           <w:rFonts w:ascii="FangSong" w:eastAsia="FangSong" w:hAnsi="FangSong"/>
-          <w:color w:val="000000" w:themeColor="text1"/>
-          <w:sz w:val="28"/>
-        </w:rPr>
-      </w:pPr>
+          <w:b/>
+          <w:color w:val="000000" w:themeColor="text1"/>
+          <w:sz w:val="28"/>
+          <w:u w:val="single"/>
+        </w:rPr>
+      </w:pPr>
+      <w:r>
+        <w:rPr>
+          <w:rFonts w:ascii="FangSong" w:eastAsia="FangSong" w:hAnsi="FangSong" w:hint="eastAsia"/>
+          <w:b/>
+          <w:color w:val="000000" w:themeColor="text1"/>
+          <w:sz w:val="28"/>
+          <w:u w:val="single"/>
+        </w:rPr>
+        <w:t>十二、</w:t>
+      </w:r>
+      <w:r>
+        <w:rPr>
+          <w:rFonts w:ascii="FangSong" w:eastAsia="FangSong" w:hAnsi="FangSong" w:hint="eastAsia"/>
+          <w:b/>
+          <w:color w:val="000000" w:themeColor="text1"/>
+          <w:sz w:val="28"/>
+          <w:u w:val="single"/>
+        </w:rPr>
+        <w:t xml:space="preserve">KDDI成立运营子公司KDDI </w:t>
+      </w:r>
+      <w:proofErr w:type="spellStart"/>
+      <w:r>
+        <w:rPr>
+          <w:rFonts w:ascii="FangSong" w:eastAsia="FangSong" w:hAnsi="FangSong" w:hint="eastAsia"/>
+          <w:b/>
+          <w:color w:val="000000" w:themeColor="text1"/>
+          <w:sz w:val="28"/>
+          <w:u w:val="single"/>
+        </w:rPr>
+        <w:t>i</w:t>
+      </w:r>
+      <w:proofErr w:type="spellEnd"/>
+      <w:r>
+        <w:rPr>
+          <w:rFonts w:ascii="FangSong" w:eastAsia="FangSong" w:hAnsi="FangSong" w:hint="eastAsia"/>
+          <w:b/>
+          <w:color w:val="000000" w:themeColor="text1"/>
+          <w:sz w:val="28"/>
+          <w:u w:val="single"/>
+        </w:rPr>
+        <w:t>-let，推进AI社会应用</w:t>
+      </w:r>
+    </w:p>
+    <w:p>
+      <w:pPr>
+        <w:widowControl/>
+        <w:rPr>
+          <w:rFonts w:ascii="FangSong" w:eastAsia="FangSong" w:hAnsi="FangSong"/>
+          <w:color w:val="000000" w:themeColor="text1"/>
+          <w:sz w:val="28"/>
+        </w:rPr>
+      </w:pPr>
+      <w:r>
+        <w:rPr>
+          <w:rFonts w:ascii="FangSong" w:eastAsia="FangSong" w:hAnsi="FangSong" w:hint="eastAsia"/>
+          <w:color w:val="000000" w:themeColor="text1"/>
+          <w:sz w:val="28"/>
+        </w:rPr>
+        <w:t>KDDI旗下中间控股公司KDDI Digital Divergence Holdings与全资子公司</w:t>
+      </w:r>
+      <w:proofErr w:type="spellStart"/>
+      <w:r>
+        <w:rPr>
+          <w:rFonts w:ascii="FangSong" w:eastAsia="FangSong" w:hAnsi="FangSong" w:hint="eastAsia"/>
+          <w:color w:val="000000" w:themeColor="text1"/>
+          <w:sz w:val="28"/>
+        </w:rPr>
+        <w:t>iRet</w:t>
+      </w:r>
+      <w:proofErr w:type="spellEnd"/>
+      <w:r>
+        <w:rPr>
+          <w:rFonts w:ascii="FangSong" w:eastAsia="FangSong" w:hAnsi="FangSong" w:hint="eastAsia"/>
+          <w:color w:val="000000" w:themeColor="text1"/>
+          <w:sz w:val="28"/>
+        </w:rPr>
+        <w:t xml:space="preserve">将于2026年4月1日合并，成立新公司KDDI </w:t>
+      </w:r>
+      <w:proofErr w:type="spellStart"/>
+      <w:r>
+        <w:rPr>
+          <w:rFonts w:ascii="FangSong" w:eastAsia="FangSong" w:hAnsi="FangSong" w:hint="eastAsia"/>
+          <w:color w:val="000000" w:themeColor="text1"/>
+          <w:sz w:val="28"/>
+        </w:rPr>
+        <w:t>iRet</w:t>
+      </w:r>
+      <w:proofErr w:type="spellEnd"/>
+      <w:r>
+        <w:rPr>
+          <w:rFonts w:ascii="FangSong" w:eastAsia="FangSong" w:hAnsi="FangSong" w:hint="eastAsia"/>
+          <w:color w:val="000000" w:themeColor="text1"/>
+          <w:sz w:val="28"/>
+        </w:rPr>
+        <w:t>。新公司将整合KDDI的部分销售与系统工程师职能，以在日本云集成领域拥有顶级经验的</w:t>
+      </w:r>
+      <w:proofErr w:type="spellStart"/>
+      <w:r>
+        <w:rPr>
+          <w:rFonts w:ascii="FangSong" w:eastAsia="FangSong" w:hAnsi="FangSong" w:hint="eastAsia"/>
+          <w:color w:val="000000" w:themeColor="text1"/>
+          <w:sz w:val="28"/>
+        </w:rPr>
+        <w:t>iRet</w:t>
+      </w:r>
+      <w:proofErr w:type="spellEnd"/>
+      <w:r>
+        <w:rPr>
+          <w:rFonts w:ascii="FangSong" w:eastAsia="FangSong" w:hAnsi="FangSong" w:hint="eastAsia"/>
+          <w:color w:val="000000" w:themeColor="text1"/>
+          <w:sz w:val="28"/>
+        </w:rPr>
+        <w:t>为</w:t>
+      </w:r>
+      <w:r>
+        <w:rPr>
+          <w:rFonts w:ascii="FangSong" w:eastAsia="FangSong" w:hAnsi="FangSong" w:hint="eastAsia"/>
+          <w:color w:val="000000" w:themeColor="text1"/>
+          <w:sz w:val="28"/>
+        </w:rPr>
+        <w:lastRenderedPageBreak/>
+        <w:t>核心，结合各集团公司的专业知识与技术能力，构建从AI项目创建到开发运营的一站式支援体系。KDDI计划到2028财年将工程技术人才扩大至约3000人，并依托大阪堺数据中心等设施，构建全国性低延迟网络与AI计算基础设施，加速AI的社会应用。</w:t>
+      </w:r>
     </w:p>
     <w:p>
       <w:pPr>
@@ -1292,21 +2728,19 @@
         <w:rPr>
           <w:rFonts w:ascii="FangSong" w:eastAsia="FangSong" w:hAnsi="FangSong"/>
           <w:b/>
-          <w:color w:val="000000" w:themeColor="text1"/>
-          <w:sz w:val="28"/>
-          <w:u w:val="single"/>
-        </w:rPr>
-      </w:pPr>
-    </w:p>
-    <w:p>
-      <w:pPr>
-        <w:widowControl/>
-        <w:rPr>
-          <w:rFonts w:ascii="FangSong" w:eastAsia="FangSong" w:hAnsi="FangSong"/>
-          <w:color w:val="000000" w:themeColor="text1"/>
-          <w:sz w:val="28"/>
-        </w:rPr>
-      </w:pPr>
+          <w:color w:val="A6A6A6" w:themeColor="background1" w:themeShade="A6"/>
+          <w:sz w:val="28"/>
+        </w:rPr>
+      </w:pPr>
+      <w:r>
+        <w:rPr>
+          <w:rFonts w:ascii="FangSong" w:eastAsia="FangSong" w:hAnsi="FangSong" w:hint="eastAsia"/>
+          <w:b/>
+          <w:color w:val="A6A6A6" w:themeColor="background1" w:themeShade="A6"/>
+          <w:sz w:val="28"/>
+        </w:rPr>
+        <w:t>行业相关监管</w:t>
+      </w:r>
     </w:p>
     <w:p>
       <w:pPr>
@@ -1315,10 +2749,59 @@
         <w:rPr>
           <w:rFonts w:ascii="FangSong" w:eastAsia="FangSong" w:hAnsi="FangSong"/>
           <w:b/>
-          <w:color w:val="A6A6A6" w:themeColor="background1" w:themeShade="A6"/>
-          <w:sz w:val="28"/>
-        </w:rPr>
-      </w:pPr>
+          <w:color w:val="000000" w:themeColor="text1"/>
+          <w:sz w:val="28"/>
+          <w:u w:val="single"/>
+        </w:rPr>
+      </w:pPr>
+      <w:r>
+        <w:rPr>
+          <w:rFonts w:ascii="FangSong" w:eastAsia="FangSong" w:hAnsi="FangSong" w:hint="eastAsia"/>
+          <w:b/>
+          <w:color w:val="000000" w:themeColor="text1"/>
+          <w:sz w:val="28"/>
+          <w:u w:val="single"/>
+        </w:rPr>
+        <w:t>十三、</w:t>
+      </w:r>
+      <w:r>
+        <w:rPr>
+          <w:rFonts w:ascii="FangSong" w:eastAsia="FangSong" w:hAnsi="FangSong" w:hint="eastAsia"/>
+          <w:b/>
+          <w:color w:val="000000" w:themeColor="text1"/>
+          <w:sz w:val="28"/>
+          <w:u w:val="single"/>
+        </w:rPr>
+        <w:t>欧盟无条件批准谷歌320亿美元收购网络安全公司Wiz</w:t>
+      </w:r>
+    </w:p>
+    <w:p>
+      <w:pPr>
+        <w:widowControl/>
+        <w:rPr>
+          <w:rFonts w:ascii="FangSong" w:eastAsia="FangSong" w:hAnsi="FangSong"/>
+          <w:color w:val="000000" w:themeColor="text1"/>
+          <w:sz w:val="28"/>
+        </w:rPr>
+      </w:pPr>
+      <w:r>
+        <w:rPr>
+          <w:rFonts w:ascii="FangSong" w:eastAsia="FangSong" w:hAnsi="FangSong" w:hint="eastAsia"/>
+          <w:color w:val="000000" w:themeColor="text1"/>
+          <w:sz w:val="28"/>
+        </w:rPr>
+        <w:t>欧盟反垄断监管机构无条件批准了谷歌母公司Alphabet以320亿美元收购网络安全公司Wiz的交易。欧盟委员会表示，该交易不会引发竞争</w:t>
+      </w:r>
+      <w:bookmarkStart w:id="9" w:name="_GoBack"/>
+      <w:bookmarkEnd w:id="9"/>
+      <w:r>
+        <w:rPr>
+          <w:rFonts w:ascii="FangSong" w:eastAsia="FangSong" w:hAnsi="FangSong" w:hint="eastAsia"/>
+          <w:color w:val="000000" w:themeColor="text1"/>
+          <w:sz w:val="28"/>
+        </w:rPr>
+        <w:t>担忧。此项收购于2025年3月宣布，是谷歌历史上规模最大的交易，旨在增强其在网络安全和云计算领域的实力，以与亚马逊和微软等更大的竞争对手抗衡。</w:t>
+      </w:r>
     </w:p>
     <w:p>
       <w:pPr>
@@ -1339,21 +2822,19 @@
         <w:rPr>
           <w:rFonts w:ascii="FangSong" w:eastAsia="FangSong" w:hAnsi="FangSong"/>
           <w:b/>
-          <w:color w:val="000000" w:themeColor="text1"/>
-          <w:sz w:val="28"/>
-          <w:u w:val="single"/>
-        </w:rPr>
-      </w:pPr>
-    </w:p>
-    <w:p>
-      <w:pPr>
-        <w:widowControl/>
-        <w:rPr>
-          <w:rFonts w:ascii="FangSong" w:eastAsia="FangSong" w:hAnsi="FangSong"/>
-          <w:color w:val="000000" w:themeColor="text1"/>
-          <w:sz w:val="28"/>
-        </w:rPr>
-      </w:pPr>
+          <w:color w:val="A6A6A6" w:themeColor="background1" w:themeShade="A6"/>
+          <w:sz w:val="28"/>
+        </w:rPr>
+      </w:pPr>
+      <w:r>
+        <w:rPr>
+          <w:rFonts w:ascii="FangSong" w:eastAsia="FangSong" w:hAnsi="FangSong" w:hint="eastAsia"/>
+          <w:b/>
+          <w:color w:val="A6A6A6" w:themeColor="background1" w:themeShade="A6"/>
+          <w:sz w:val="28"/>
+        </w:rPr>
+        <w:t>跨境贸易</w:t>
+      </w:r>
     </w:p>
     <w:p>
       <w:pPr>
@@ -1362,10 +2843,143 @@
         <w:rPr>
           <w:rFonts w:ascii="FangSong" w:eastAsia="FangSong" w:hAnsi="FangSong"/>
           <w:b/>
-          <w:color w:val="A6A6A6" w:themeColor="background1" w:themeShade="A6"/>
-          <w:sz w:val="28"/>
-        </w:rPr>
-      </w:pPr>
+          <w:color w:val="000000" w:themeColor="text1"/>
+          <w:sz w:val="28"/>
+          <w:u w:val="single"/>
+        </w:rPr>
+      </w:pPr>
+      <w:r>
+        <w:rPr>
+          <w:rFonts w:ascii="FangSong" w:eastAsia="FangSong" w:hAnsi="FangSong" w:hint="eastAsia"/>
+          <w:b/>
+          <w:color w:val="000000" w:themeColor="text1"/>
+          <w:sz w:val="28"/>
+          <w:u w:val="single"/>
+        </w:rPr>
+        <w:t>十四、</w:t>
+      </w:r>
+      <w:r>
+        <w:rPr>
+          <w:rFonts w:ascii="FangSong" w:eastAsia="FangSong" w:hAnsi="FangSong" w:hint="eastAsia"/>
+          <w:b/>
+          <w:color w:val="000000" w:themeColor="text1"/>
+          <w:sz w:val="28"/>
+          <w:u w:val="single"/>
+        </w:rPr>
+        <w:t>京东自建欧洲物流网络</w:t>
+      </w:r>
+      <w:proofErr w:type="spellStart"/>
+      <w:r>
+        <w:rPr>
+          <w:rFonts w:ascii="FangSong" w:eastAsia="FangSong" w:hAnsi="FangSong" w:hint="eastAsia"/>
+          <w:b/>
+          <w:color w:val="000000" w:themeColor="text1"/>
+          <w:sz w:val="28"/>
+          <w:u w:val="single"/>
+        </w:rPr>
+        <w:t>JoyExpress</w:t>
+      </w:r>
+      <w:proofErr w:type="spellEnd"/>
+      <w:r>
+        <w:rPr>
+          <w:rFonts w:ascii="FangSong" w:eastAsia="FangSong" w:hAnsi="FangSong" w:hint="eastAsia"/>
+          <w:b/>
+          <w:color w:val="000000" w:themeColor="text1"/>
+          <w:sz w:val="28"/>
+          <w:u w:val="single"/>
+        </w:rPr>
+        <w:t>上线，支持同日及次日达</w:t>
+      </w:r>
+    </w:p>
+    <w:p>
+      <w:pPr>
+        <w:widowControl/>
+        <w:rPr>
+          <w:rFonts w:ascii="FangSong" w:eastAsia="FangSong" w:hAnsi="FangSong"/>
+          <w:color w:val="000000" w:themeColor="text1"/>
+          <w:sz w:val="28"/>
+        </w:rPr>
+      </w:pPr>
+      <w:r>
+        <w:rPr>
+          <w:rFonts w:ascii="FangSong" w:eastAsia="FangSong" w:hAnsi="FangSong" w:hint="eastAsia"/>
+          <w:color w:val="000000" w:themeColor="text1"/>
+          <w:sz w:val="28"/>
+        </w:rPr>
+        <w:t>京东宣布在欧推出自建快递服务</w:t>
+      </w:r>
+      <w:proofErr w:type="spellStart"/>
+      <w:r>
+        <w:rPr>
+          <w:rFonts w:ascii="FangSong" w:eastAsia="FangSong" w:hAnsi="FangSong" w:hint="eastAsia"/>
+          <w:color w:val="000000" w:themeColor="text1"/>
+          <w:sz w:val="28"/>
+        </w:rPr>
+        <w:t>JoyExpress</w:t>
+      </w:r>
+      <w:proofErr w:type="spellEnd"/>
+      <w:r>
+        <w:rPr>
+          <w:rFonts w:ascii="FangSong" w:eastAsia="FangSong" w:hAnsi="FangSong" w:hint="eastAsia"/>
+          <w:color w:val="000000" w:themeColor="text1"/>
+          <w:sz w:val="28"/>
+        </w:rPr>
+        <w:t>，作为旗下京东物流的一部分，将支持其新零售业务</w:t>
+      </w:r>
+      <w:proofErr w:type="spellStart"/>
+      <w:r>
+        <w:rPr>
+          <w:rFonts w:ascii="FangSong" w:eastAsia="FangSong" w:hAnsi="FangSong" w:hint="eastAsia"/>
+          <w:color w:val="000000" w:themeColor="text1"/>
+          <w:sz w:val="28"/>
+        </w:rPr>
+        <w:t>Joybuy</w:t>
+      </w:r>
+      <w:proofErr w:type="spellEnd"/>
+      <w:r>
+        <w:rPr>
+          <w:rFonts w:ascii="FangSong" w:eastAsia="FangSong" w:hAnsi="FangSong" w:hint="eastAsia"/>
+          <w:color w:val="000000" w:themeColor="text1"/>
+          <w:sz w:val="28"/>
+        </w:rPr>
+        <w:t>的欧洲配送。</w:t>
+      </w:r>
+      <w:proofErr w:type="spellStart"/>
+      <w:r>
+        <w:rPr>
+          <w:rFonts w:ascii="FangSong" w:eastAsia="FangSong" w:hAnsi="FangSong" w:hint="eastAsia"/>
+          <w:color w:val="000000" w:themeColor="text1"/>
+          <w:sz w:val="28"/>
+        </w:rPr>
+        <w:t>JoyExpress</w:t>
+      </w:r>
+      <w:proofErr w:type="spellEnd"/>
+      <w:r>
+        <w:rPr>
+          <w:rFonts w:ascii="FangSong" w:eastAsia="FangSong" w:hAnsi="FangSong" w:hint="eastAsia"/>
+          <w:color w:val="000000" w:themeColor="text1"/>
+          <w:sz w:val="28"/>
+        </w:rPr>
+        <w:t>团队分布在英国、德国、荷兰和法国，运营超过60个仓库和配送站，在主要城市提供同日及次日达服务，并为大型家电提供配送安装一体化服务。该服务以品牌制服和车辆运营，整合了仓储、运输、大件物流、冷链及端到端供应链管理技术。未来，</w:t>
+      </w:r>
+      <w:proofErr w:type="spellStart"/>
+      <w:r>
+        <w:rPr>
+          <w:rFonts w:ascii="FangSong" w:eastAsia="FangSong" w:hAnsi="FangSong" w:hint="eastAsia"/>
+          <w:color w:val="000000" w:themeColor="text1"/>
+          <w:sz w:val="28"/>
+        </w:rPr>
+        <w:t>JoyExpress</w:t>
+      </w:r>
+      <w:proofErr w:type="spellEnd"/>
+      <w:r>
+        <w:rPr>
+          <w:rFonts w:ascii="FangSong" w:eastAsia="FangSong" w:hAnsi="FangSong" w:hint="eastAsia"/>
+          <w:color w:val="000000" w:themeColor="text1"/>
+          <w:sz w:val="28"/>
+        </w:rPr>
+        <w:t>也将向业务伙伴提供配送支持。</w:t>
+      </w:r>
     </w:p>
     <w:p>
       <w:pPr>
@@ -1386,21 +3000,20 @@
         <w:rPr>
           <w:rFonts w:ascii="FangSong" w:eastAsia="FangSong" w:hAnsi="FangSong"/>
           <w:b/>
-          <w:color w:val="000000" w:themeColor="text1"/>
-          <w:sz w:val="28"/>
-          <w:u w:val="single"/>
-        </w:rPr>
-      </w:pPr>
-    </w:p>
-    <w:p>
-      <w:pPr>
-        <w:widowControl/>
-        <w:rPr>
-          <w:rFonts w:ascii="FangSong" w:eastAsia="FangSong" w:hAnsi="FangSong"/>
-          <w:color w:val="000000" w:themeColor="text1"/>
-          <w:sz w:val="28"/>
-        </w:rPr>
-      </w:pPr>
+          <w:color w:val="A6A6A6" w:themeColor="background1" w:themeShade="A6"/>
+          <w:sz w:val="28"/>
+        </w:rPr>
+      </w:pPr>
+      <w:r>
+        <w:rPr>
+          <w:rFonts w:ascii="FangSong" w:eastAsia="FangSong" w:hAnsi="FangSong" w:hint="eastAsia"/>
+          <w:b/>
+          <w:color w:val="A6A6A6" w:themeColor="background1" w:themeShade="A6"/>
+          <w:sz w:val="28"/>
+        </w:rPr>
+        <w:lastRenderedPageBreak/>
+        <w:t>友商动态</w:t>
+      </w:r>
     </w:p>
     <w:p>
       <w:pPr>
@@ -1409,82 +3022,31 @@
         <w:rPr>
           <w:rFonts w:ascii="FangSong" w:eastAsia="FangSong" w:hAnsi="FangSong"/>
           <w:b/>
-          <w:color w:val="A6A6A6" w:themeColor="background1" w:themeShade="A6"/>
-          <w:sz w:val="28"/>
-        </w:rPr>
-      </w:pPr>
-    </w:p>
-    <w:p>
-      <w:pPr>
-        <w:widowControl/>
-        <w:jc w:val="left"/>
-        <w:rPr>
-          <w:rFonts w:ascii="FangSong" w:eastAsia="FangSong" w:hAnsi="FangSong"/>
-          <w:b/>
-          <w:color w:val="A6A6A6" w:themeColor="background1" w:themeShade="A6"/>
-          <w:sz w:val="28"/>
-        </w:rPr>
-      </w:pPr>
-    </w:p>
-    <w:p>
-      <w:pPr>
-        <w:widowControl/>
-        <w:jc w:val="left"/>
-        <w:rPr>
-          <w:rFonts w:ascii="FangSong" w:eastAsia="FangSong" w:hAnsi="FangSong"/>
-          <w:b/>
           <w:color w:val="000000" w:themeColor="text1"/>
           <w:sz w:val="28"/>
           <w:u w:val="single"/>
         </w:rPr>
       </w:pPr>
-    </w:p>
-    <w:p>
-      <w:pPr>
-        <w:widowControl/>
-        <w:rPr>
-          <w:rFonts w:ascii="FangSong" w:eastAsia="FangSong" w:hAnsi="FangSong"/>
-          <w:color w:val="000000" w:themeColor="text1"/>
-          <w:sz w:val="28"/>
-        </w:rPr>
-      </w:pPr>
-    </w:p>
-    <w:p>
-      <w:pPr>
-        <w:widowControl/>
-        <w:jc w:val="left"/>
-        <w:rPr>
-          <w:rFonts w:ascii="FangSong" w:eastAsia="FangSong" w:hAnsi="FangSong"/>
-          <w:b/>
-          <w:color w:val="A6A6A6" w:themeColor="background1" w:themeShade="A6"/>
-          <w:sz w:val="28"/>
-        </w:rPr>
-      </w:pPr>
-    </w:p>
-    <w:p>
-      <w:pPr>
-        <w:widowControl/>
-        <w:jc w:val="left"/>
-        <w:rPr>
-          <w:rFonts w:ascii="FangSong" w:eastAsia="FangSong" w:hAnsi="FangSong"/>
-          <w:b/>
-          <w:color w:val="A6A6A6" w:themeColor="background1" w:themeShade="A6"/>
-          <w:sz w:val="28"/>
-        </w:rPr>
-      </w:pPr>
-    </w:p>
-    <w:p>
-      <w:pPr>
-        <w:widowControl/>
-        <w:jc w:val="left"/>
-        <w:rPr>
-          <w:rFonts w:ascii="FangSong" w:eastAsia="FangSong" w:hAnsi="FangSong"/>
+      <w:r>
+        <w:rPr>
+          <w:rFonts w:ascii="FangSong" w:eastAsia="FangSong" w:hAnsi="FangSong" w:hint="eastAsia"/>
           <w:b/>
           <w:color w:val="000000" w:themeColor="text1"/>
           <w:sz w:val="28"/>
           <w:u w:val="single"/>
         </w:rPr>
-      </w:pPr>
+        <w:t>十五、</w:t>
+      </w:r>
+      <w:r>
+        <w:rPr>
+          <w:rFonts w:ascii="FangSong" w:eastAsia="FangSong" w:hAnsi="FangSong" w:hint="eastAsia"/>
+          <w:b/>
+          <w:color w:val="000000" w:themeColor="text1"/>
+          <w:sz w:val="28"/>
+          <w:u w:val="single"/>
+        </w:rPr>
+        <w:t>AT&amp;T与AWS深度整合光纤、卫星与云服务，构建全域企业连接新生态</w:t>
+      </w:r>
     </w:p>
     <w:p>
       <w:pPr>
@@ -1494,6 +3056,14 @@
           <w:sz w:val="28"/>
         </w:rPr>
       </w:pPr>
+      <w:r>
+        <w:rPr>
+          <w:rFonts w:ascii="FangSong" w:eastAsia="FangSong" w:hAnsi="FangSong" w:hint="eastAsia"/>
+          <w:color w:val="000000" w:themeColor="text1"/>
+          <w:sz w:val="28"/>
+        </w:rPr>
+        <w:t>AT&amp;T与亚马逊云科技（AWS）达成合作，将整合双方的光纤、卫星及云基础设施，以提升企业连接的覆盖范围与性能。此次合作将专注于运营商内部网络的现代化改造，并建立互连链路以增强云服务商的数据中心传输能力。业界认为，此举是将地面与非地面网络与超大规模云计算融合的务实路径，旨在应对复杂环境运营需求，并在以往商业上不可行的地区实现连接服务变现。</w:t>
+      </w:r>
     </w:p>
     <w:sectPr>
       <w:headerReference w:type="default" r:id="rId10"/>

</xml_diff>